<commit_message>
update JLPT Personal Bunbou
</commit_message>
<xml_diff>
--- a/exams/JLPT_Personal_1_Answer.docx
+++ b/exams/JLPT_Personal_1_Answer.docx
@@ -10,7 +10,7 @@
           <w:tab w:val="left" w:pos="6435"/>
         </w:tabs>
         <w:rPr>
-          <w:rFonts w:asciiTheme="minorHAnsi" w:eastAsia="UD Digi Kyokasho N" w:hAnsiTheme="minorHAnsi" w:hint="eastAsia"/>
+          <w:rFonts w:asciiTheme="minorHAnsi" w:eastAsia="UD Digi Kyokasho N" w:hAnsiTheme="minorHAnsi"/>
           <w:b/>
           <w:bCs w:val="0"/>
           <w:color w:val="EE0000"/>
@@ -106,11 +106,41 @@
                 <w:tab w:val="left" w:pos="6435"/>
               </w:tabs>
               <w:rPr>
+                <w:rFonts w:ascii="UD Digi Kyokasho N" w:eastAsia="UD Digi Kyokasho N" w:hAnsiTheme="minorHAnsi"/>
+                <w:b/>
+                <w:bCs w:val="0"/>
+                <w:color w:val="auto"/>
+              </w:rPr>
+            </w:pPr>
+            <w:r>
+              <w:rPr>
                 <w:rFonts w:ascii="UD Digi Kyokasho N" w:eastAsia="UD Digi Kyokasho N" w:hAnsiTheme="minorHAnsi" w:hint="eastAsia"/>
                 <w:b/>
                 <w:bCs w:val="0"/>
                 <w:color w:val="auto"/>
               </w:rPr>
+              <w:t>１</w:t>
+            </w:r>
+          </w:p>
+        </w:tc>
+        <w:tc>
+          <w:tcPr>
+            <w:tcW w:w="719" w:type="dxa"/>
+            <w:vAlign w:val="center"/>
+          </w:tcPr>
+          <w:p>
+            <w:pPr>
+              <w:tabs>
+                <w:tab w:val="left" w:pos="720"/>
+                <w:tab w:val="left" w:pos="2400"/>
+                <w:tab w:val="left" w:pos="6435"/>
+              </w:tabs>
+              <w:rPr>
+                <w:rFonts w:ascii="UD Digi Kyokasho N" w:eastAsia="UD Digi Kyokasho N" w:hAnsiTheme="minorHAnsi"/>
+                <w:b/>
+                <w:bCs w:val="0"/>
+                <w:color w:val="auto"/>
+              </w:rPr>
             </w:pPr>
             <w:r>
               <w:rPr>
@@ -119,28 +149,58 @@
                 <w:bCs w:val="0"/>
                 <w:color w:val="auto"/>
               </w:rPr>
-              <w:t>１</w:t>
-            </w:r>
-          </w:p>
-        </w:tc>
-        <w:tc>
-          <w:tcPr>
-            <w:tcW w:w="719" w:type="dxa"/>
-            <w:vAlign w:val="center"/>
-          </w:tcPr>
-          <w:p>
-            <w:pPr>
-              <w:tabs>
-                <w:tab w:val="left" w:pos="720"/>
-                <w:tab w:val="left" w:pos="2400"/>
-                <w:tab w:val="left" w:pos="6435"/>
-              </w:tabs>
+              <w:t>２</w:t>
+            </w:r>
+          </w:p>
+        </w:tc>
+        <w:tc>
+          <w:tcPr>
+            <w:tcW w:w="719" w:type="dxa"/>
+            <w:vAlign w:val="center"/>
+          </w:tcPr>
+          <w:p>
+            <w:pPr>
+              <w:tabs>
+                <w:tab w:val="left" w:pos="720"/>
+                <w:tab w:val="left" w:pos="2400"/>
+                <w:tab w:val="left" w:pos="6435"/>
+              </w:tabs>
+              <w:rPr>
+                <w:rFonts w:ascii="UD Digi Kyokasho N" w:eastAsia="UD Digi Kyokasho N" w:hAnsiTheme="minorHAnsi"/>
+                <w:b/>
+                <w:bCs w:val="0"/>
+                <w:color w:val="auto"/>
+              </w:rPr>
+            </w:pPr>
+            <w:r>
               <w:rPr>
                 <w:rFonts w:ascii="UD Digi Kyokasho N" w:eastAsia="UD Digi Kyokasho N" w:hAnsiTheme="minorHAnsi" w:hint="eastAsia"/>
                 <w:b/>
                 <w:bCs w:val="0"/>
                 <w:color w:val="auto"/>
               </w:rPr>
+              <w:t>３</w:t>
+            </w:r>
+          </w:p>
+        </w:tc>
+        <w:tc>
+          <w:tcPr>
+            <w:tcW w:w="719" w:type="dxa"/>
+            <w:vAlign w:val="center"/>
+          </w:tcPr>
+          <w:p>
+            <w:pPr>
+              <w:tabs>
+                <w:tab w:val="left" w:pos="720"/>
+                <w:tab w:val="left" w:pos="2400"/>
+                <w:tab w:val="left" w:pos="6435"/>
+              </w:tabs>
+              <w:rPr>
+                <w:rFonts w:ascii="UD Digi Kyokasho N" w:eastAsia="UD Digi Kyokasho N" w:hAnsiTheme="minorHAnsi"/>
+                <w:b/>
+                <w:bCs w:val="0"/>
+                <w:color w:val="auto"/>
+              </w:rPr>
             </w:pPr>
             <w:r>
               <w:rPr>
@@ -149,28 +209,58 @@
                 <w:bCs w:val="0"/>
                 <w:color w:val="auto"/>
               </w:rPr>
-              <w:t>２</w:t>
-            </w:r>
-          </w:p>
-        </w:tc>
-        <w:tc>
-          <w:tcPr>
-            <w:tcW w:w="719" w:type="dxa"/>
-            <w:vAlign w:val="center"/>
-          </w:tcPr>
-          <w:p>
-            <w:pPr>
-              <w:tabs>
-                <w:tab w:val="left" w:pos="720"/>
-                <w:tab w:val="left" w:pos="2400"/>
-                <w:tab w:val="left" w:pos="6435"/>
-              </w:tabs>
+              <w:t>４</w:t>
+            </w:r>
+          </w:p>
+        </w:tc>
+        <w:tc>
+          <w:tcPr>
+            <w:tcW w:w="719" w:type="dxa"/>
+            <w:vAlign w:val="center"/>
+          </w:tcPr>
+          <w:p>
+            <w:pPr>
+              <w:tabs>
+                <w:tab w:val="left" w:pos="720"/>
+                <w:tab w:val="left" w:pos="2400"/>
+                <w:tab w:val="left" w:pos="6435"/>
+              </w:tabs>
+              <w:rPr>
+                <w:rFonts w:ascii="UD Digi Kyokasho N" w:eastAsia="UD Digi Kyokasho N" w:hAnsiTheme="minorHAnsi"/>
+                <w:b/>
+                <w:bCs w:val="0"/>
+                <w:color w:val="auto"/>
+              </w:rPr>
+            </w:pPr>
+            <w:r>
               <w:rPr>
                 <w:rFonts w:ascii="UD Digi Kyokasho N" w:eastAsia="UD Digi Kyokasho N" w:hAnsiTheme="minorHAnsi" w:hint="eastAsia"/>
                 <w:b/>
                 <w:bCs w:val="0"/>
                 <w:color w:val="auto"/>
               </w:rPr>
+              <w:t>５</w:t>
+            </w:r>
+          </w:p>
+        </w:tc>
+        <w:tc>
+          <w:tcPr>
+            <w:tcW w:w="719" w:type="dxa"/>
+            <w:vAlign w:val="center"/>
+          </w:tcPr>
+          <w:p>
+            <w:pPr>
+              <w:tabs>
+                <w:tab w:val="left" w:pos="720"/>
+                <w:tab w:val="left" w:pos="2400"/>
+                <w:tab w:val="left" w:pos="6435"/>
+              </w:tabs>
+              <w:rPr>
+                <w:rFonts w:ascii="UD Digi Kyokasho N" w:eastAsia="UD Digi Kyokasho N" w:hAnsiTheme="minorHAnsi"/>
+                <w:b/>
+                <w:bCs w:val="0"/>
+                <w:color w:val="auto"/>
+              </w:rPr>
             </w:pPr>
             <w:r>
               <w:rPr>
@@ -179,28 +269,58 @@
                 <w:bCs w:val="0"/>
                 <w:color w:val="auto"/>
               </w:rPr>
-              <w:t>３</w:t>
-            </w:r>
-          </w:p>
-        </w:tc>
-        <w:tc>
-          <w:tcPr>
-            <w:tcW w:w="719" w:type="dxa"/>
-            <w:vAlign w:val="center"/>
-          </w:tcPr>
-          <w:p>
-            <w:pPr>
-              <w:tabs>
-                <w:tab w:val="left" w:pos="720"/>
-                <w:tab w:val="left" w:pos="2400"/>
-                <w:tab w:val="left" w:pos="6435"/>
-              </w:tabs>
+              <w:t>６</w:t>
+            </w:r>
+          </w:p>
+        </w:tc>
+        <w:tc>
+          <w:tcPr>
+            <w:tcW w:w="719" w:type="dxa"/>
+            <w:vAlign w:val="center"/>
+          </w:tcPr>
+          <w:p>
+            <w:pPr>
+              <w:tabs>
+                <w:tab w:val="left" w:pos="720"/>
+                <w:tab w:val="left" w:pos="2400"/>
+                <w:tab w:val="left" w:pos="6435"/>
+              </w:tabs>
+              <w:rPr>
+                <w:rFonts w:ascii="UD Digi Kyokasho N" w:eastAsia="UD Digi Kyokasho N" w:hAnsiTheme="minorHAnsi"/>
+                <w:b/>
+                <w:bCs w:val="0"/>
+                <w:color w:val="auto"/>
+              </w:rPr>
+            </w:pPr>
+            <w:r>
               <w:rPr>
                 <w:rFonts w:ascii="UD Digi Kyokasho N" w:eastAsia="UD Digi Kyokasho N" w:hAnsiTheme="minorHAnsi" w:hint="eastAsia"/>
                 <w:b/>
                 <w:bCs w:val="0"/>
                 <w:color w:val="auto"/>
               </w:rPr>
+              <w:t>７</w:t>
+            </w:r>
+          </w:p>
+        </w:tc>
+        <w:tc>
+          <w:tcPr>
+            <w:tcW w:w="719" w:type="dxa"/>
+            <w:vAlign w:val="center"/>
+          </w:tcPr>
+          <w:p>
+            <w:pPr>
+              <w:tabs>
+                <w:tab w:val="left" w:pos="720"/>
+                <w:tab w:val="left" w:pos="2400"/>
+                <w:tab w:val="left" w:pos="6435"/>
+              </w:tabs>
+              <w:rPr>
+                <w:rFonts w:ascii="UD Digi Kyokasho N" w:eastAsia="UD Digi Kyokasho N" w:hAnsiTheme="minorHAnsi"/>
+                <w:b/>
+                <w:bCs w:val="0"/>
+                <w:color w:val="auto"/>
+              </w:rPr>
             </w:pPr>
             <w:r>
               <w:rPr>
@@ -209,28 +329,58 @@
                 <w:bCs w:val="0"/>
                 <w:color w:val="auto"/>
               </w:rPr>
-              <w:t>４</w:t>
-            </w:r>
-          </w:p>
-        </w:tc>
-        <w:tc>
-          <w:tcPr>
-            <w:tcW w:w="719" w:type="dxa"/>
-            <w:vAlign w:val="center"/>
-          </w:tcPr>
-          <w:p>
-            <w:pPr>
-              <w:tabs>
-                <w:tab w:val="left" w:pos="720"/>
-                <w:tab w:val="left" w:pos="2400"/>
-                <w:tab w:val="left" w:pos="6435"/>
-              </w:tabs>
+              <w:t>８</w:t>
+            </w:r>
+          </w:p>
+        </w:tc>
+        <w:tc>
+          <w:tcPr>
+            <w:tcW w:w="719" w:type="dxa"/>
+            <w:vAlign w:val="center"/>
+          </w:tcPr>
+          <w:p>
+            <w:pPr>
+              <w:tabs>
+                <w:tab w:val="left" w:pos="720"/>
+                <w:tab w:val="left" w:pos="2400"/>
+                <w:tab w:val="left" w:pos="6435"/>
+              </w:tabs>
+              <w:rPr>
+                <w:rFonts w:ascii="UD Digi Kyokasho N" w:eastAsia="UD Digi Kyokasho N" w:hAnsiTheme="minorHAnsi"/>
+                <w:b/>
+                <w:bCs w:val="0"/>
+                <w:color w:val="auto"/>
+              </w:rPr>
+            </w:pPr>
+            <w:r>
               <w:rPr>
                 <w:rFonts w:ascii="UD Digi Kyokasho N" w:eastAsia="UD Digi Kyokasho N" w:hAnsiTheme="minorHAnsi" w:hint="eastAsia"/>
                 <w:b/>
                 <w:bCs w:val="0"/>
                 <w:color w:val="auto"/>
               </w:rPr>
+              <w:t>９</w:t>
+            </w:r>
+          </w:p>
+        </w:tc>
+        <w:tc>
+          <w:tcPr>
+            <w:tcW w:w="719" w:type="dxa"/>
+            <w:vAlign w:val="center"/>
+          </w:tcPr>
+          <w:p>
+            <w:pPr>
+              <w:tabs>
+                <w:tab w:val="left" w:pos="720"/>
+                <w:tab w:val="left" w:pos="2400"/>
+                <w:tab w:val="left" w:pos="6435"/>
+              </w:tabs>
+              <w:rPr>
+                <w:rFonts w:ascii="UD Digi Kyokasho N" w:eastAsia="UD Digi Kyokasho N" w:hAnsiTheme="minorHAnsi"/>
+                <w:b/>
+                <w:bCs w:val="0"/>
+                <w:color w:val="auto"/>
+              </w:rPr>
             </w:pPr>
             <w:r>
               <w:rPr>
@@ -239,157 +389,37 @@
                 <w:bCs w:val="0"/>
                 <w:color w:val="auto"/>
               </w:rPr>
-              <w:t>５</w:t>
-            </w:r>
-          </w:p>
-        </w:tc>
-        <w:tc>
-          <w:tcPr>
-            <w:tcW w:w="719" w:type="dxa"/>
-            <w:vAlign w:val="center"/>
-          </w:tcPr>
-          <w:p>
-            <w:pPr>
-              <w:tabs>
-                <w:tab w:val="left" w:pos="720"/>
-                <w:tab w:val="left" w:pos="2400"/>
-                <w:tab w:val="left" w:pos="6435"/>
-              </w:tabs>
+              <w:t>10</w:t>
+            </w:r>
+          </w:p>
+        </w:tc>
+        <w:tc>
+          <w:tcPr>
+            <w:tcW w:w="720" w:type="dxa"/>
+            <w:vAlign w:val="center"/>
+          </w:tcPr>
+          <w:p>
+            <w:pPr>
+              <w:tabs>
+                <w:tab w:val="left" w:pos="720"/>
+                <w:tab w:val="left" w:pos="2400"/>
+                <w:tab w:val="left" w:pos="6435"/>
+              </w:tabs>
+              <w:rPr>
+                <w:rFonts w:ascii="UD Digi Kyokasho N" w:eastAsia="UD Digi Kyokasho N" w:hAnsiTheme="minorHAnsi"/>
+                <w:b/>
+                <w:bCs w:val="0"/>
+                <w:color w:val="auto"/>
+              </w:rPr>
+            </w:pPr>
+            <w:r>
               <w:rPr>
                 <w:rFonts w:ascii="UD Digi Kyokasho N" w:eastAsia="UD Digi Kyokasho N" w:hAnsiTheme="minorHAnsi" w:hint="eastAsia"/>
                 <w:b/>
                 <w:bCs w:val="0"/>
                 <w:color w:val="auto"/>
               </w:rPr>
-            </w:pPr>
-            <w:r>
-              <w:rPr>
-                <w:rFonts w:ascii="UD Digi Kyokasho N" w:eastAsia="UD Digi Kyokasho N" w:hAnsiTheme="minorHAnsi" w:hint="eastAsia"/>
-                <w:b/>
-                <w:bCs w:val="0"/>
-                <w:color w:val="auto"/>
-              </w:rPr>
-              <w:t>６</w:t>
-            </w:r>
-          </w:p>
-        </w:tc>
-        <w:tc>
-          <w:tcPr>
-            <w:tcW w:w="719" w:type="dxa"/>
-            <w:vAlign w:val="center"/>
-          </w:tcPr>
-          <w:p>
-            <w:pPr>
-              <w:tabs>
-                <w:tab w:val="left" w:pos="720"/>
-                <w:tab w:val="left" w:pos="2400"/>
-                <w:tab w:val="left" w:pos="6435"/>
-              </w:tabs>
-              <w:rPr>
-                <w:rFonts w:ascii="UD Digi Kyokasho N" w:eastAsia="UD Digi Kyokasho N" w:hAnsiTheme="minorHAnsi" w:hint="eastAsia"/>
-                <w:b/>
-                <w:bCs w:val="0"/>
-                <w:color w:val="auto"/>
-              </w:rPr>
-            </w:pPr>
-            <w:r>
-              <w:rPr>
-                <w:rFonts w:ascii="UD Digi Kyokasho N" w:eastAsia="UD Digi Kyokasho N" w:hAnsiTheme="minorHAnsi" w:hint="eastAsia"/>
-                <w:b/>
-                <w:bCs w:val="0"/>
-                <w:color w:val="auto"/>
-              </w:rPr>
-              <w:t>７</w:t>
-            </w:r>
-          </w:p>
-        </w:tc>
-        <w:tc>
-          <w:tcPr>
-            <w:tcW w:w="719" w:type="dxa"/>
-            <w:vAlign w:val="center"/>
-          </w:tcPr>
-          <w:p>
-            <w:pPr>
-              <w:tabs>
-                <w:tab w:val="left" w:pos="720"/>
-                <w:tab w:val="left" w:pos="2400"/>
-                <w:tab w:val="left" w:pos="6435"/>
-              </w:tabs>
-              <w:rPr>
-                <w:rFonts w:ascii="UD Digi Kyokasho N" w:eastAsia="UD Digi Kyokasho N" w:hAnsiTheme="minorHAnsi" w:hint="eastAsia"/>
-                <w:b/>
-                <w:bCs w:val="0"/>
-                <w:color w:val="auto"/>
-              </w:rPr>
-            </w:pPr>
-            <w:r>
-              <w:rPr>
-                <w:rFonts w:ascii="UD Digi Kyokasho N" w:eastAsia="UD Digi Kyokasho N" w:hAnsiTheme="minorHAnsi" w:hint="eastAsia"/>
-                <w:b/>
-                <w:bCs w:val="0"/>
-                <w:color w:val="auto"/>
-              </w:rPr>
-              <w:t>８</w:t>
-            </w:r>
-          </w:p>
-        </w:tc>
-        <w:tc>
-          <w:tcPr>
-            <w:tcW w:w="719" w:type="dxa"/>
-            <w:vAlign w:val="center"/>
-          </w:tcPr>
-          <w:p>
-            <w:pPr>
-              <w:tabs>
-                <w:tab w:val="left" w:pos="720"/>
-                <w:tab w:val="left" w:pos="2400"/>
-                <w:tab w:val="left" w:pos="6435"/>
-              </w:tabs>
-              <w:rPr>
-                <w:rFonts w:ascii="UD Digi Kyokasho N" w:eastAsia="UD Digi Kyokasho N" w:hAnsiTheme="minorHAnsi" w:hint="eastAsia"/>
-                <w:b/>
-                <w:bCs w:val="0"/>
-                <w:color w:val="auto"/>
-              </w:rPr>
-            </w:pPr>
-            <w:r>
-              <w:rPr>
-                <w:rFonts w:ascii="UD Digi Kyokasho N" w:eastAsia="UD Digi Kyokasho N" w:hAnsiTheme="minorHAnsi" w:hint="eastAsia"/>
-                <w:b/>
-                <w:bCs w:val="0"/>
-                <w:color w:val="auto"/>
-              </w:rPr>
-              <w:t>９</w:t>
-            </w:r>
-          </w:p>
-        </w:tc>
-        <w:tc>
-          <w:tcPr>
-            <w:tcW w:w="719" w:type="dxa"/>
-            <w:vAlign w:val="center"/>
-          </w:tcPr>
-          <w:p>
-            <w:pPr>
-              <w:tabs>
-                <w:tab w:val="left" w:pos="720"/>
-                <w:tab w:val="left" w:pos="2400"/>
-                <w:tab w:val="left" w:pos="6435"/>
-              </w:tabs>
-              <w:rPr>
-                <w:rFonts w:ascii="UD Digi Kyokasho N" w:eastAsia="UD Digi Kyokasho N" w:hAnsiTheme="minorHAnsi" w:hint="eastAsia"/>
-                <w:b/>
-                <w:bCs w:val="0"/>
-                <w:color w:val="auto"/>
-              </w:rPr>
-            </w:pPr>
-            <w:r>
-              <w:rPr>
-                <w:rFonts w:ascii="UD Digi Kyokasho N" w:eastAsia="UD Digi Kyokasho N" w:hAnsiTheme="minorHAnsi" w:hint="eastAsia"/>
-                <w:b/>
-                <w:bCs w:val="0"/>
-                <w:color w:val="auto"/>
-              </w:rPr>
-              <w:t>10</w:t>
+              <w:t>11</w:t>
             </w:r>
           </w:p>
         </w:tc>
@@ -406,37 +436,7 @@
                 <w:tab w:val="left" w:pos="6435"/>
               </w:tabs>
               <w:rPr>
-                <w:rFonts w:ascii="UD Digi Kyokasho N" w:eastAsia="UD Digi Kyokasho N" w:hAnsiTheme="minorHAnsi" w:hint="eastAsia"/>
-                <w:b/>
-                <w:bCs w:val="0"/>
-                <w:color w:val="auto"/>
-              </w:rPr>
-            </w:pPr>
-            <w:r>
-              <w:rPr>
-                <w:rFonts w:ascii="UD Digi Kyokasho N" w:eastAsia="UD Digi Kyokasho N" w:hAnsiTheme="minorHAnsi" w:hint="eastAsia"/>
-                <w:b/>
-                <w:bCs w:val="0"/>
-                <w:color w:val="auto"/>
-              </w:rPr>
-              <w:t>11</w:t>
-            </w:r>
-          </w:p>
-        </w:tc>
-        <w:tc>
-          <w:tcPr>
-            <w:tcW w:w="720" w:type="dxa"/>
-            <w:vAlign w:val="center"/>
-          </w:tcPr>
-          <w:p>
-            <w:pPr>
-              <w:tabs>
-                <w:tab w:val="left" w:pos="720"/>
-                <w:tab w:val="left" w:pos="2400"/>
-                <w:tab w:val="left" w:pos="6435"/>
-              </w:tabs>
-              <w:rPr>
-                <w:rFonts w:ascii="UD Digi Kyokasho N" w:eastAsia="UD Digi Kyokasho N" w:hAnsiTheme="minorHAnsi" w:hint="eastAsia"/>
+                <w:rFonts w:ascii="UD Digi Kyokasho N" w:eastAsia="UD Digi Kyokasho N" w:hAnsiTheme="minorHAnsi"/>
                 <w:b/>
                 <w:bCs w:val="0"/>
                 <w:color w:val="auto"/>
@@ -471,7 +471,7 @@
                 <w:tab w:val="left" w:pos="6435"/>
               </w:tabs>
               <w:rPr>
-                <w:rFonts w:asciiTheme="minorHAnsi" w:eastAsia="UD Digi Kyokasho N" w:hAnsiTheme="minorHAnsi" w:hint="eastAsia"/>
+                <w:rFonts w:asciiTheme="minorHAnsi" w:eastAsia="UD Digi Kyokasho N" w:hAnsiTheme="minorHAnsi"/>
                 <w:b/>
                 <w:bCs w:val="0"/>
                 <w:color w:val="auto"/>
@@ -522,7 +522,7 @@
           <w:p>
             <w:pPr>
               <w:rPr>
-                <w:rFonts w:asciiTheme="minorHAnsi" w:eastAsia="UD Digi Kyokasho N" w:hAnsiTheme="minorHAnsi" w:hint="eastAsia"/>
+                <w:rFonts w:asciiTheme="minorHAnsi" w:eastAsia="UD Digi Kyokasho N" w:hAnsiTheme="minorHAnsi"/>
                 <w:color w:val="auto"/>
               </w:rPr>
             </w:pPr>
@@ -600,7 +600,7 @@
                 <w:tab w:val="left" w:pos="6435"/>
               </w:tabs>
               <w:rPr>
-                <w:rFonts w:asciiTheme="minorHAnsi" w:eastAsia="UD Digi Kyokasho N" w:hAnsiTheme="minorHAnsi" w:hint="eastAsia"/>
+                <w:rFonts w:asciiTheme="minorHAnsi" w:eastAsia="UD Digi Kyokasho N" w:hAnsiTheme="minorHAnsi"/>
                 <w:color w:val="auto"/>
               </w:rPr>
             </w:pPr>
@@ -819,7 +819,7 @@
                 <w:tab w:val="left" w:pos="6435"/>
               </w:tabs>
               <w:rPr>
-                <w:rFonts w:asciiTheme="minorHAnsi" w:eastAsia="UD Digi Kyokasho N" w:hAnsiTheme="minorHAnsi" w:hint="eastAsia"/>
+                <w:rFonts w:asciiTheme="minorHAnsi" w:eastAsia="UD Digi Kyokasho N" w:hAnsiTheme="minorHAnsi"/>
                 <w:b/>
                 <w:bCs w:val="0"/>
                 <w:color w:val="auto"/>
@@ -1137,7 +1137,7 @@
                 <w:tab w:val="left" w:pos="6435"/>
               </w:tabs>
               <w:rPr>
-                <w:rFonts w:asciiTheme="minorHAnsi" w:eastAsia="UD Digi Kyokasho N" w:hAnsiTheme="minorHAnsi" w:hint="eastAsia"/>
+                <w:rFonts w:asciiTheme="minorHAnsi" w:eastAsia="UD Digi Kyokasho N" w:hAnsiTheme="minorHAnsi"/>
                 <w:b/>
                 <w:bCs w:val="0"/>
                 <w:color w:val="auto"/>
@@ -1297,7 +1297,7 @@
                 <w:tab w:val="left" w:pos="6435"/>
               </w:tabs>
               <w:rPr>
-                <w:rFonts w:asciiTheme="minorHAnsi" w:eastAsia="UD Digi Kyokasho N" w:hAnsiTheme="minorHAnsi" w:hint="eastAsia"/>
+                <w:rFonts w:asciiTheme="minorHAnsi" w:eastAsia="UD Digi Kyokasho N" w:hAnsiTheme="minorHAnsi"/>
                 <w:color w:val="auto"/>
               </w:rPr>
             </w:pPr>
@@ -1465,7 +1465,7 @@
                 <w:tab w:val="left" w:pos="6435"/>
               </w:tabs>
               <w:rPr>
-                <w:rFonts w:asciiTheme="minorHAnsi" w:eastAsia="UD Digi Kyokasho N" w:hAnsiTheme="minorHAnsi" w:hint="eastAsia"/>
+                <w:rFonts w:asciiTheme="minorHAnsi" w:eastAsia="UD Digi Kyokasho N" w:hAnsiTheme="minorHAnsi"/>
                 <w:color w:val="auto"/>
               </w:rPr>
             </w:pPr>
@@ -1496,7 +1496,7 @@
                 <w:tab w:val="left" w:pos="6435"/>
               </w:tabs>
               <w:rPr>
-                <w:rFonts w:asciiTheme="minorHAnsi" w:eastAsia="UD Digi Kyokasho N" w:hAnsiTheme="minorHAnsi" w:hint="eastAsia"/>
+                <w:rFonts w:asciiTheme="minorHAnsi" w:eastAsia="UD Digi Kyokasho N" w:hAnsiTheme="minorHAnsi"/>
                 <w:b/>
                 <w:bCs w:val="0"/>
                 <w:color w:val="auto"/>
@@ -1757,6 +1757,1981 @@
         <w:rPr>
           <w:rFonts w:asciiTheme="minorHAnsi" w:eastAsia="UD Digi Kyokasho N" w:hAnsiTheme="minorHAnsi"/>
           <w:color w:val="auto"/>
+        </w:rPr>
+      </w:pPr>
+    </w:p>
+    <w:p>
+      <w:pPr>
+        <w:tabs>
+          <w:tab w:val="left" w:pos="720"/>
+          <w:tab w:val="left" w:pos="2400"/>
+          <w:tab w:val="left" w:pos="6435"/>
+        </w:tabs>
+        <w:jc w:val="both"/>
+        <w:rPr>
+          <w:rFonts w:asciiTheme="minorHAnsi" w:eastAsia="UD Digi Kyokasho N" w:hAnsiTheme="minorHAnsi"/>
+          <w:color w:val="auto"/>
+        </w:rPr>
+      </w:pPr>
+    </w:p>
+    <w:p>
+      <w:pPr>
+        <w:tabs>
+          <w:tab w:val="left" w:pos="720"/>
+          <w:tab w:val="left" w:pos="2400"/>
+          <w:tab w:val="left" w:pos="6435"/>
+        </w:tabs>
+        <w:jc w:val="both"/>
+        <w:rPr>
+          <w:rFonts w:asciiTheme="minorHAnsi" w:eastAsia="UD Digi Kyokasho N" w:hAnsiTheme="minorHAnsi"/>
+          <w:color w:val="auto"/>
+        </w:rPr>
+      </w:pPr>
+    </w:p>
+    <w:p>
+      <w:pPr>
+        <w:tabs>
+          <w:tab w:val="left" w:pos="720"/>
+          <w:tab w:val="left" w:pos="2400"/>
+          <w:tab w:val="left" w:pos="6435"/>
+        </w:tabs>
+        <w:jc w:val="both"/>
+        <w:rPr>
+          <w:rFonts w:asciiTheme="minorHAnsi" w:eastAsia="UD Digi Kyokasho N" w:hAnsiTheme="minorHAnsi"/>
+          <w:color w:val="auto"/>
+        </w:rPr>
+      </w:pPr>
+    </w:p>
+    <w:p>
+      <w:pPr>
+        <w:tabs>
+          <w:tab w:val="left" w:pos="720"/>
+          <w:tab w:val="left" w:pos="2400"/>
+          <w:tab w:val="left" w:pos="6435"/>
+        </w:tabs>
+        <w:jc w:val="both"/>
+        <w:rPr>
+          <w:rFonts w:asciiTheme="minorHAnsi" w:eastAsia="UD Digi Kyokasho N" w:hAnsiTheme="minorHAnsi"/>
+          <w:color w:val="auto"/>
+        </w:rPr>
+      </w:pPr>
+    </w:p>
+    <w:p>
+      <w:pPr>
+        <w:tabs>
+          <w:tab w:val="left" w:pos="720"/>
+          <w:tab w:val="left" w:pos="2400"/>
+          <w:tab w:val="left" w:pos="6435"/>
+        </w:tabs>
+        <w:jc w:val="both"/>
+        <w:rPr>
+          <w:rFonts w:asciiTheme="minorHAnsi" w:eastAsia="UD Digi Kyokasho N" w:hAnsiTheme="minorHAnsi"/>
+          <w:color w:val="auto"/>
+        </w:rPr>
+      </w:pPr>
+    </w:p>
+    <w:p>
+      <w:pPr>
+        <w:tabs>
+          <w:tab w:val="left" w:pos="720"/>
+          <w:tab w:val="left" w:pos="2400"/>
+          <w:tab w:val="left" w:pos="6435"/>
+        </w:tabs>
+        <w:jc w:val="both"/>
+        <w:rPr>
+          <w:rFonts w:asciiTheme="minorHAnsi" w:eastAsia="UD Digi Kyokasho N" w:hAnsiTheme="minorHAnsi"/>
+          <w:color w:val="auto"/>
+        </w:rPr>
+      </w:pPr>
+    </w:p>
+    <w:p>
+      <w:pPr>
+        <w:tabs>
+          <w:tab w:val="left" w:pos="720"/>
+          <w:tab w:val="left" w:pos="2400"/>
+          <w:tab w:val="left" w:pos="6435"/>
+        </w:tabs>
+        <w:jc w:val="both"/>
+        <w:rPr>
+          <w:rFonts w:asciiTheme="minorHAnsi" w:eastAsia="UD Digi Kyokasho N" w:hAnsiTheme="minorHAnsi"/>
+          <w:color w:val="auto"/>
+        </w:rPr>
+      </w:pPr>
+    </w:p>
+    <w:p>
+      <w:pPr>
+        <w:tabs>
+          <w:tab w:val="left" w:pos="720"/>
+          <w:tab w:val="left" w:pos="2400"/>
+          <w:tab w:val="left" w:pos="6435"/>
+        </w:tabs>
+        <w:jc w:val="both"/>
+        <w:rPr>
+          <w:rFonts w:asciiTheme="minorHAnsi" w:eastAsia="UD Digi Kyokasho N" w:hAnsiTheme="minorHAnsi"/>
+          <w:color w:val="auto"/>
+        </w:rPr>
+      </w:pPr>
+    </w:p>
+    <w:p>
+      <w:pPr>
+        <w:tabs>
+          <w:tab w:val="left" w:pos="720"/>
+          <w:tab w:val="left" w:pos="2400"/>
+          <w:tab w:val="left" w:pos="6435"/>
+        </w:tabs>
+        <w:jc w:val="both"/>
+        <w:rPr>
+          <w:rFonts w:asciiTheme="minorHAnsi" w:eastAsia="UD Digi Kyokasho N" w:hAnsiTheme="minorHAnsi"/>
+          <w:color w:val="auto"/>
+        </w:rPr>
+      </w:pPr>
+    </w:p>
+    <w:p>
+      <w:pPr>
+        <w:tabs>
+          <w:tab w:val="left" w:pos="720"/>
+          <w:tab w:val="left" w:pos="2400"/>
+          <w:tab w:val="left" w:pos="6435"/>
+        </w:tabs>
+        <w:jc w:val="both"/>
+        <w:rPr>
+          <w:rFonts w:asciiTheme="minorHAnsi" w:eastAsia="UD Digi Kyokasho N" w:hAnsiTheme="minorHAnsi"/>
+          <w:color w:val="auto"/>
+        </w:rPr>
+      </w:pPr>
+    </w:p>
+    <w:p>
+      <w:pPr>
+        <w:tabs>
+          <w:tab w:val="left" w:pos="720"/>
+          <w:tab w:val="left" w:pos="2400"/>
+          <w:tab w:val="left" w:pos="6435"/>
+        </w:tabs>
+        <w:jc w:val="both"/>
+        <w:rPr>
+          <w:rFonts w:asciiTheme="minorHAnsi" w:eastAsia="UD Digi Kyokasho N" w:hAnsiTheme="minorHAnsi"/>
+          <w:color w:val="auto"/>
+        </w:rPr>
+      </w:pPr>
+    </w:p>
+    <w:p>
+      <w:pPr>
+        <w:tabs>
+          <w:tab w:val="left" w:pos="720"/>
+          <w:tab w:val="left" w:pos="2400"/>
+          <w:tab w:val="left" w:pos="6435"/>
+        </w:tabs>
+        <w:jc w:val="both"/>
+        <w:rPr>
+          <w:rFonts w:asciiTheme="minorHAnsi" w:eastAsia="UD Digi Kyokasho N" w:hAnsiTheme="minorHAnsi"/>
+          <w:color w:val="auto"/>
+        </w:rPr>
+      </w:pPr>
+    </w:p>
+    <w:p>
+      <w:pPr>
+        <w:tabs>
+          <w:tab w:val="left" w:pos="720"/>
+          <w:tab w:val="left" w:pos="2400"/>
+          <w:tab w:val="left" w:pos="6435"/>
+        </w:tabs>
+        <w:jc w:val="both"/>
+        <w:rPr>
+          <w:rFonts w:asciiTheme="minorHAnsi" w:eastAsia="UD Digi Kyokasho N" w:hAnsiTheme="minorHAnsi"/>
+          <w:color w:val="auto"/>
+        </w:rPr>
+      </w:pPr>
+    </w:p>
+    <w:p>
+      <w:pPr>
+        <w:tabs>
+          <w:tab w:val="left" w:pos="720"/>
+          <w:tab w:val="left" w:pos="2400"/>
+          <w:tab w:val="left" w:pos="6435"/>
+        </w:tabs>
+        <w:jc w:val="both"/>
+        <w:rPr>
+          <w:rFonts w:asciiTheme="minorHAnsi" w:eastAsia="UD Digi Kyokasho N" w:hAnsiTheme="minorHAnsi"/>
+          <w:color w:val="auto"/>
+        </w:rPr>
+      </w:pPr>
+    </w:p>
+    <w:p>
+      <w:pPr>
+        <w:tabs>
+          <w:tab w:val="left" w:pos="720"/>
+          <w:tab w:val="left" w:pos="2400"/>
+          <w:tab w:val="left" w:pos="6435"/>
+        </w:tabs>
+        <w:jc w:val="both"/>
+        <w:rPr>
+          <w:rFonts w:asciiTheme="minorHAnsi" w:eastAsia="UD Digi Kyokasho N" w:hAnsiTheme="minorHAnsi"/>
+          <w:color w:val="auto"/>
+        </w:rPr>
+      </w:pPr>
+    </w:p>
+    <w:p>
+      <w:pPr>
+        <w:tabs>
+          <w:tab w:val="left" w:pos="720"/>
+          <w:tab w:val="left" w:pos="2400"/>
+          <w:tab w:val="left" w:pos="6435"/>
+        </w:tabs>
+        <w:jc w:val="both"/>
+        <w:rPr>
+          <w:rFonts w:asciiTheme="minorHAnsi" w:eastAsia="UD Digi Kyokasho N" w:hAnsiTheme="minorHAnsi"/>
+          <w:color w:val="auto"/>
+        </w:rPr>
+      </w:pPr>
+    </w:p>
+    <w:p>
+      <w:pPr>
+        <w:tabs>
+          <w:tab w:val="left" w:pos="720"/>
+          <w:tab w:val="left" w:pos="2400"/>
+          <w:tab w:val="left" w:pos="6435"/>
+        </w:tabs>
+        <w:jc w:val="both"/>
+        <w:rPr>
+          <w:rFonts w:asciiTheme="minorHAnsi" w:eastAsia="UD Digi Kyokasho N" w:hAnsiTheme="minorHAnsi"/>
+          <w:color w:val="auto"/>
+        </w:rPr>
+      </w:pPr>
+    </w:p>
+    <w:p>
+      <w:pPr>
+        <w:tabs>
+          <w:tab w:val="left" w:pos="720"/>
+          <w:tab w:val="left" w:pos="2400"/>
+          <w:tab w:val="left" w:pos="6435"/>
+        </w:tabs>
+        <w:jc w:val="both"/>
+        <w:rPr>
+          <w:rFonts w:asciiTheme="minorHAnsi" w:eastAsia="UD Digi Kyokasho N" w:hAnsiTheme="minorHAnsi"/>
+          <w:color w:val="auto"/>
+        </w:rPr>
+      </w:pPr>
+    </w:p>
+    <w:p>
+      <w:pPr>
+        <w:tabs>
+          <w:tab w:val="left" w:pos="720"/>
+          <w:tab w:val="left" w:pos="2400"/>
+          <w:tab w:val="left" w:pos="6435"/>
+        </w:tabs>
+        <w:jc w:val="both"/>
+        <w:rPr>
+          <w:rFonts w:asciiTheme="minorHAnsi" w:eastAsia="UD Digi Kyokasho N" w:hAnsiTheme="minorHAnsi"/>
+          <w:color w:val="auto"/>
+        </w:rPr>
+      </w:pPr>
+    </w:p>
+    <w:p>
+      <w:pPr>
+        <w:tabs>
+          <w:tab w:val="left" w:pos="720"/>
+          <w:tab w:val="left" w:pos="2400"/>
+          <w:tab w:val="left" w:pos="6435"/>
+        </w:tabs>
+        <w:jc w:val="both"/>
+        <w:rPr>
+          <w:rFonts w:asciiTheme="minorHAnsi" w:eastAsia="UD Digi Kyokasho N" w:hAnsiTheme="minorHAnsi"/>
+          <w:color w:val="auto"/>
+        </w:rPr>
+      </w:pPr>
+    </w:p>
+    <w:p>
+      <w:pPr>
+        <w:tabs>
+          <w:tab w:val="left" w:pos="720"/>
+          <w:tab w:val="left" w:pos="2400"/>
+          <w:tab w:val="left" w:pos="6435"/>
+        </w:tabs>
+        <w:jc w:val="both"/>
+        <w:rPr>
+          <w:rFonts w:asciiTheme="minorHAnsi" w:eastAsia="UD Digi Kyokasho N" w:hAnsiTheme="minorHAnsi"/>
+          <w:color w:val="auto"/>
+        </w:rPr>
+      </w:pPr>
+    </w:p>
+    <w:p>
+      <w:pPr>
+        <w:tabs>
+          <w:tab w:val="left" w:pos="720"/>
+          <w:tab w:val="left" w:pos="2400"/>
+          <w:tab w:val="left" w:pos="6435"/>
+        </w:tabs>
+        <w:rPr>
+          <w:rFonts w:asciiTheme="minorHAnsi" w:eastAsia="UD Digi Kyokasho N" w:hAnsiTheme="minorHAnsi"/>
+          <w:b/>
+          <w:bCs w:val="0"/>
+          <w:color w:val="EE0000"/>
+          <w:szCs w:val="24"/>
+        </w:rPr>
+      </w:pPr>
+      <w:r>
+        <w:rPr>
+          <w:rFonts w:asciiTheme="minorHAnsi" w:eastAsia="UD Digi Kyokasho N" w:hAnsiTheme="minorHAnsi"/>
+          <w:b/>
+          <w:bCs w:val="0"/>
+          <w:color w:val="EE0000"/>
+          <w:sz w:val="28"/>
+        </w:rPr>
+        <w:lastRenderedPageBreak/>
+        <w:t>解答</w:t>
+      </w:r>
+      <w:r>
+        <w:rPr>
+          <w:rFonts w:asciiTheme="minorHAnsi" w:eastAsia="UD Digi Kyokasho N" w:hAnsiTheme="minorHAnsi" w:hint="eastAsia"/>
+          <w:b/>
+          <w:bCs w:val="0"/>
+          <w:color w:val="EE0000"/>
+          <w:sz w:val="28"/>
+        </w:rPr>
+        <w:t>‐</w:t>
+      </w:r>
+      <w:r>
+        <w:rPr>
+          <w:rFonts w:asciiTheme="minorHAnsi" w:eastAsia="UD Digi Kyokasho N" w:hAnsiTheme="minorHAnsi" w:hint="eastAsia"/>
+          <w:b/>
+          <w:bCs w:val="0"/>
+          <w:color w:val="EE0000"/>
+          <w:szCs w:val="24"/>
+        </w:rPr>
+        <w:t>ぶんぽう</w:t>
+      </w:r>
+      <w:r>
+        <w:rPr>
+          <w:rFonts w:ascii="UD Digi Kyokasho N" w:eastAsia="UD Digi Kyokasho N" w:hint="eastAsia"/>
+          <w:b/>
+          <w:bCs w:val="0"/>
+          <w:color w:val="EE0000"/>
+          <w:szCs w:val="24"/>
+        </w:rPr>
+        <w:t>・</w:t>
+      </w:r>
+      <w:r>
+        <w:rPr>
+          <w:rFonts w:asciiTheme="minorHAnsi" w:eastAsia="UD Digi Kyokasho N" w:hAnsiTheme="minorHAnsi" w:hint="eastAsia"/>
+          <w:b/>
+          <w:bCs w:val="0"/>
+          <w:color w:val="EE0000"/>
+          <w:szCs w:val="24"/>
+        </w:rPr>
+        <w:t>どっかい</w:t>
+      </w:r>
+    </w:p>
+    <w:tbl>
+      <w:tblPr>
+        <w:tblStyle w:val="TableGrid"/>
+        <w:tblW w:w="0" w:type="auto"/>
+        <w:jc w:val="center"/>
+        <w:tblLook w:val="04A0" w:firstRow="1" w:lastRow="0" w:firstColumn="1" w:lastColumn="0" w:noHBand="0" w:noVBand="1"/>
+      </w:tblPr>
+      <w:tblGrid>
+        <w:gridCol w:w="720"/>
+        <w:gridCol w:w="719"/>
+        <w:gridCol w:w="719"/>
+        <w:gridCol w:w="719"/>
+        <w:gridCol w:w="719"/>
+        <w:gridCol w:w="719"/>
+        <w:gridCol w:w="719"/>
+        <w:gridCol w:w="719"/>
+        <w:gridCol w:w="719"/>
+        <w:gridCol w:w="719"/>
+        <w:gridCol w:w="719"/>
+        <w:gridCol w:w="720"/>
+        <w:gridCol w:w="720"/>
+      </w:tblGrid>
+      <w:tr>
+        <w:trPr>
+          <w:jc w:val="center"/>
+        </w:trPr>
+        <w:tc>
+          <w:tcPr>
+            <w:tcW w:w="720" w:type="dxa"/>
+            <w:vAlign w:val="center"/>
+          </w:tcPr>
+          <w:p>
+            <w:pPr>
+              <w:tabs>
+                <w:tab w:val="left" w:pos="720"/>
+                <w:tab w:val="left" w:pos="2400"/>
+                <w:tab w:val="left" w:pos="6435"/>
+              </w:tabs>
+              <w:rPr>
+                <w:rFonts w:asciiTheme="minorHAnsi" w:eastAsia="UD Digi Kyokasho N" w:hAnsiTheme="minorHAnsi"/>
+                <w:color w:val="auto"/>
+              </w:rPr>
+            </w:pPr>
+          </w:p>
+        </w:tc>
+        <w:tc>
+          <w:tcPr>
+            <w:tcW w:w="719" w:type="dxa"/>
+            <w:vAlign w:val="center"/>
+          </w:tcPr>
+          <w:p>
+            <w:pPr>
+              <w:tabs>
+                <w:tab w:val="left" w:pos="720"/>
+                <w:tab w:val="left" w:pos="2400"/>
+                <w:tab w:val="left" w:pos="6435"/>
+              </w:tabs>
+              <w:rPr>
+                <w:rFonts w:ascii="UD Digi Kyokasho N" w:eastAsia="UD Digi Kyokasho N" w:hAnsiTheme="minorHAnsi"/>
+                <w:b/>
+                <w:bCs w:val="0"/>
+                <w:color w:val="auto"/>
+              </w:rPr>
+            </w:pPr>
+            <w:r>
+              <w:rPr>
+                <w:rFonts w:ascii="UD Digi Kyokasho N" w:eastAsia="UD Digi Kyokasho N" w:hAnsiTheme="minorHAnsi" w:hint="eastAsia"/>
+                <w:b/>
+                <w:bCs w:val="0"/>
+                <w:color w:val="auto"/>
+              </w:rPr>
+              <w:t>１</w:t>
+            </w:r>
+          </w:p>
+        </w:tc>
+        <w:tc>
+          <w:tcPr>
+            <w:tcW w:w="719" w:type="dxa"/>
+            <w:vAlign w:val="center"/>
+          </w:tcPr>
+          <w:p>
+            <w:pPr>
+              <w:tabs>
+                <w:tab w:val="left" w:pos="720"/>
+                <w:tab w:val="left" w:pos="2400"/>
+                <w:tab w:val="left" w:pos="6435"/>
+              </w:tabs>
+              <w:rPr>
+                <w:rFonts w:ascii="UD Digi Kyokasho N" w:eastAsia="UD Digi Kyokasho N" w:hAnsiTheme="minorHAnsi"/>
+                <w:b/>
+                <w:bCs w:val="0"/>
+                <w:color w:val="auto"/>
+              </w:rPr>
+            </w:pPr>
+            <w:r>
+              <w:rPr>
+                <w:rFonts w:ascii="UD Digi Kyokasho N" w:eastAsia="UD Digi Kyokasho N" w:hAnsiTheme="minorHAnsi" w:hint="eastAsia"/>
+                <w:b/>
+                <w:bCs w:val="0"/>
+                <w:color w:val="auto"/>
+              </w:rPr>
+              <w:t>２</w:t>
+            </w:r>
+          </w:p>
+        </w:tc>
+        <w:tc>
+          <w:tcPr>
+            <w:tcW w:w="719" w:type="dxa"/>
+            <w:vAlign w:val="center"/>
+          </w:tcPr>
+          <w:p>
+            <w:pPr>
+              <w:tabs>
+                <w:tab w:val="left" w:pos="720"/>
+                <w:tab w:val="left" w:pos="2400"/>
+                <w:tab w:val="left" w:pos="6435"/>
+              </w:tabs>
+              <w:rPr>
+                <w:rFonts w:ascii="UD Digi Kyokasho N" w:eastAsia="UD Digi Kyokasho N" w:hAnsiTheme="minorHAnsi"/>
+                <w:b/>
+                <w:bCs w:val="0"/>
+                <w:color w:val="auto"/>
+              </w:rPr>
+            </w:pPr>
+            <w:r>
+              <w:rPr>
+                <w:rFonts w:ascii="UD Digi Kyokasho N" w:eastAsia="UD Digi Kyokasho N" w:hAnsiTheme="minorHAnsi" w:hint="eastAsia"/>
+                <w:b/>
+                <w:bCs w:val="0"/>
+                <w:color w:val="auto"/>
+              </w:rPr>
+              <w:t>３</w:t>
+            </w:r>
+          </w:p>
+        </w:tc>
+        <w:tc>
+          <w:tcPr>
+            <w:tcW w:w="719" w:type="dxa"/>
+            <w:vAlign w:val="center"/>
+          </w:tcPr>
+          <w:p>
+            <w:pPr>
+              <w:tabs>
+                <w:tab w:val="left" w:pos="720"/>
+                <w:tab w:val="left" w:pos="2400"/>
+                <w:tab w:val="left" w:pos="6435"/>
+              </w:tabs>
+              <w:rPr>
+                <w:rFonts w:ascii="UD Digi Kyokasho N" w:eastAsia="UD Digi Kyokasho N" w:hAnsiTheme="minorHAnsi"/>
+                <w:b/>
+                <w:bCs w:val="0"/>
+                <w:color w:val="auto"/>
+              </w:rPr>
+            </w:pPr>
+            <w:r>
+              <w:rPr>
+                <w:rFonts w:ascii="UD Digi Kyokasho N" w:eastAsia="UD Digi Kyokasho N" w:hAnsiTheme="minorHAnsi" w:hint="eastAsia"/>
+                <w:b/>
+                <w:bCs w:val="0"/>
+                <w:color w:val="auto"/>
+              </w:rPr>
+              <w:t>４</w:t>
+            </w:r>
+          </w:p>
+        </w:tc>
+        <w:tc>
+          <w:tcPr>
+            <w:tcW w:w="719" w:type="dxa"/>
+            <w:vAlign w:val="center"/>
+          </w:tcPr>
+          <w:p>
+            <w:pPr>
+              <w:tabs>
+                <w:tab w:val="left" w:pos="720"/>
+                <w:tab w:val="left" w:pos="2400"/>
+                <w:tab w:val="left" w:pos="6435"/>
+              </w:tabs>
+              <w:rPr>
+                <w:rFonts w:ascii="UD Digi Kyokasho N" w:eastAsia="UD Digi Kyokasho N" w:hAnsiTheme="minorHAnsi"/>
+                <w:b/>
+                <w:bCs w:val="0"/>
+                <w:color w:val="auto"/>
+              </w:rPr>
+            </w:pPr>
+            <w:r>
+              <w:rPr>
+                <w:rFonts w:ascii="UD Digi Kyokasho N" w:eastAsia="UD Digi Kyokasho N" w:hAnsiTheme="minorHAnsi" w:hint="eastAsia"/>
+                <w:b/>
+                <w:bCs w:val="0"/>
+                <w:color w:val="auto"/>
+              </w:rPr>
+              <w:t>５</w:t>
+            </w:r>
+          </w:p>
+        </w:tc>
+        <w:tc>
+          <w:tcPr>
+            <w:tcW w:w="719" w:type="dxa"/>
+            <w:vAlign w:val="center"/>
+          </w:tcPr>
+          <w:p>
+            <w:pPr>
+              <w:tabs>
+                <w:tab w:val="left" w:pos="720"/>
+                <w:tab w:val="left" w:pos="2400"/>
+                <w:tab w:val="left" w:pos="6435"/>
+              </w:tabs>
+              <w:rPr>
+                <w:rFonts w:ascii="UD Digi Kyokasho N" w:eastAsia="UD Digi Kyokasho N" w:hAnsiTheme="minorHAnsi"/>
+                <w:b/>
+                <w:bCs w:val="0"/>
+                <w:color w:val="auto"/>
+              </w:rPr>
+            </w:pPr>
+            <w:r>
+              <w:rPr>
+                <w:rFonts w:ascii="UD Digi Kyokasho N" w:eastAsia="UD Digi Kyokasho N" w:hAnsiTheme="minorHAnsi" w:hint="eastAsia"/>
+                <w:b/>
+                <w:bCs w:val="0"/>
+                <w:color w:val="auto"/>
+              </w:rPr>
+              <w:t>６</w:t>
+            </w:r>
+          </w:p>
+        </w:tc>
+        <w:tc>
+          <w:tcPr>
+            <w:tcW w:w="719" w:type="dxa"/>
+            <w:vAlign w:val="center"/>
+          </w:tcPr>
+          <w:p>
+            <w:pPr>
+              <w:tabs>
+                <w:tab w:val="left" w:pos="720"/>
+                <w:tab w:val="left" w:pos="2400"/>
+                <w:tab w:val="left" w:pos="6435"/>
+              </w:tabs>
+              <w:rPr>
+                <w:rFonts w:ascii="UD Digi Kyokasho N" w:eastAsia="UD Digi Kyokasho N" w:hAnsiTheme="minorHAnsi"/>
+                <w:b/>
+                <w:bCs w:val="0"/>
+                <w:color w:val="auto"/>
+              </w:rPr>
+            </w:pPr>
+            <w:r>
+              <w:rPr>
+                <w:rFonts w:ascii="UD Digi Kyokasho N" w:eastAsia="UD Digi Kyokasho N" w:hAnsiTheme="minorHAnsi" w:hint="eastAsia"/>
+                <w:b/>
+                <w:bCs w:val="0"/>
+                <w:color w:val="auto"/>
+              </w:rPr>
+              <w:t>７</w:t>
+            </w:r>
+          </w:p>
+        </w:tc>
+        <w:tc>
+          <w:tcPr>
+            <w:tcW w:w="719" w:type="dxa"/>
+            <w:vAlign w:val="center"/>
+          </w:tcPr>
+          <w:p>
+            <w:pPr>
+              <w:tabs>
+                <w:tab w:val="left" w:pos="720"/>
+                <w:tab w:val="left" w:pos="2400"/>
+                <w:tab w:val="left" w:pos="6435"/>
+              </w:tabs>
+              <w:rPr>
+                <w:rFonts w:ascii="UD Digi Kyokasho N" w:eastAsia="UD Digi Kyokasho N" w:hAnsiTheme="minorHAnsi"/>
+                <w:b/>
+                <w:bCs w:val="0"/>
+                <w:color w:val="auto"/>
+              </w:rPr>
+            </w:pPr>
+            <w:r>
+              <w:rPr>
+                <w:rFonts w:ascii="UD Digi Kyokasho N" w:eastAsia="UD Digi Kyokasho N" w:hAnsiTheme="minorHAnsi" w:hint="eastAsia"/>
+                <w:b/>
+                <w:bCs w:val="0"/>
+                <w:color w:val="auto"/>
+              </w:rPr>
+              <w:t>８</w:t>
+            </w:r>
+          </w:p>
+        </w:tc>
+        <w:tc>
+          <w:tcPr>
+            <w:tcW w:w="719" w:type="dxa"/>
+            <w:vAlign w:val="center"/>
+          </w:tcPr>
+          <w:p>
+            <w:pPr>
+              <w:tabs>
+                <w:tab w:val="left" w:pos="720"/>
+                <w:tab w:val="left" w:pos="2400"/>
+                <w:tab w:val="left" w:pos="6435"/>
+              </w:tabs>
+              <w:rPr>
+                <w:rFonts w:ascii="UD Digi Kyokasho N" w:eastAsia="UD Digi Kyokasho N" w:hAnsiTheme="minorHAnsi"/>
+                <w:b/>
+                <w:bCs w:val="0"/>
+                <w:color w:val="auto"/>
+              </w:rPr>
+            </w:pPr>
+            <w:r>
+              <w:rPr>
+                <w:rFonts w:ascii="UD Digi Kyokasho N" w:eastAsia="UD Digi Kyokasho N" w:hAnsiTheme="minorHAnsi" w:hint="eastAsia"/>
+                <w:b/>
+                <w:bCs w:val="0"/>
+                <w:color w:val="auto"/>
+              </w:rPr>
+              <w:t>９</w:t>
+            </w:r>
+          </w:p>
+        </w:tc>
+        <w:tc>
+          <w:tcPr>
+            <w:tcW w:w="719" w:type="dxa"/>
+            <w:vAlign w:val="center"/>
+          </w:tcPr>
+          <w:p>
+            <w:pPr>
+              <w:tabs>
+                <w:tab w:val="left" w:pos="720"/>
+                <w:tab w:val="left" w:pos="2400"/>
+                <w:tab w:val="left" w:pos="6435"/>
+              </w:tabs>
+              <w:rPr>
+                <w:rFonts w:ascii="UD Digi Kyokasho N" w:eastAsia="UD Digi Kyokasho N" w:hAnsiTheme="minorHAnsi"/>
+                <w:b/>
+                <w:bCs w:val="0"/>
+                <w:color w:val="auto"/>
+              </w:rPr>
+            </w:pPr>
+            <w:r>
+              <w:rPr>
+                <w:rFonts w:ascii="UD Digi Kyokasho N" w:eastAsia="UD Digi Kyokasho N" w:hAnsiTheme="minorHAnsi" w:hint="eastAsia"/>
+                <w:b/>
+                <w:bCs w:val="0"/>
+                <w:color w:val="auto"/>
+              </w:rPr>
+              <w:t>10</w:t>
+            </w:r>
+          </w:p>
+        </w:tc>
+        <w:tc>
+          <w:tcPr>
+            <w:tcW w:w="720" w:type="dxa"/>
+            <w:vAlign w:val="center"/>
+          </w:tcPr>
+          <w:p>
+            <w:pPr>
+              <w:tabs>
+                <w:tab w:val="left" w:pos="720"/>
+                <w:tab w:val="left" w:pos="2400"/>
+                <w:tab w:val="left" w:pos="6435"/>
+              </w:tabs>
+              <w:rPr>
+                <w:rFonts w:ascii="UD Digi Kyokasho N" w:eastAsia="UD Digi Kyokasho N" w:hAnsiTheme="minorHAnsi"/>
+                <w:b/>
+                <w:bCs w:val="0"/>
+                <w:color w:val="auto"/>
+              </w:rPr>
+            </w:pPr>
+            <w:r>
+              <w:rPr>
+                <w:rFonts w:ascii="UD Digi Kyokasho N" w:eastAsia="UD Digi Kyokasho N" w:hAnsiTheme="minorHAnsi" w:hint="eastAsia"/>
+                <w:b/>
+                <w:bCs w:val="0"/>
+                <w:color w:val="auto"/>
+              </w:rPr>
+              <w:t>11</w:t>
+            </w:r>
+          </w:p>
+        </w:tc>
+        <w:tc>
+          <w:tcPr>
+            <w:tcW w:w="720" w:type="dxa"/>
+            <w:vAlign w:val="center"/>
+          </w:tcPr>
+          <w:p>
+            <w:pPr>
+              <w:tabs>
+                <w:tab w:val="left" w:pos="720"/>
+                <w:tab w:val="left" w:pos="2400"/>
+                <w:tab w:val="left" w:pos="6435"/>
+              </w:tabs>
+              <w:rPr>
+                <w:rFonts w:ascii="UD Digi Kyokasho N" w:eastAsia="UD Digi Kyokasho N" w:hAnsiTheme="minorHAnsi"/>
+                <w:b/>
+                <w:bCs w:val="0"/>
+                <w:color w:val="auto"/>
+              </w:rPr>
+            </w:pPr>
+            <w:r>
+              <w:rPr>
+                <w:rFonts w:ascii="UD Digi Kyokasho N" w:eastAsia="UD Digi Kyokasho N" w:hAnsiTheme="minorHAnsi" w:hint="eastAsia"/>
+                <w:b/>
+                <w:bCs w:val="0"/>
+                <w:color w:val="auto"/>
+              </w:rPr>
+              <w:t>12</w:t>
+            </w:r>
+          </w:p>
+        </w:tc>
+      </w:tr>
+      <w:tr>
+        <w:trPr>
+          <w:jc w:val="center"/>
+        </w:trPr>
+        <w:tc>
+          <w:tcPr>
+            <w:tcW w:w="720" w:type="dxa"/>
+            <w:vAlign w:val="center"/>
+          </w:tcPr>
+          <w:p>
+            <w:pPr>
+              <w:tabs>
+                <w:tab w:val="left" w:pos="720"/>
+                <w:tab w:val="left" w:pos="2400"/>
+                <w:tab w:val="left" w:pos="6435"/>
+              </w:tabs>
+              <w:rPr>
+                <w:rFonts w:asciiTheme="minorHAnsi" w:eastAsia="UD Digi Kyokasho N" w:hAnsiTheme="minorHAnsi"/>
+                <w:b/>
+                <w:bCs w:val="0"/>
+                <w:color w:val="auto"/>
+              </w:rPr>
+            </w:pPr>
+            <w:r>
+              <w:rPr>
+                <w:rFonts w:asciiTheme="minorHAnsi" w:eastAsia="UD Digi Kyokasho N" w:hAnsiTheme="minorHAnsi" w:hint="eastAsia"/>
+                <w:b/>
+                <w:bCs w:val="0"/>
+                <w:color w:val="auto"/>
+              </w:rPr>
+              <w:t>もんだい１</w:t>
+            </w:r>
+          </w:p>
+        </w:tc>
+        <w:tc>
+          <w:tcPr>
+            <w:tcW w:w="719" w:type="dxa"/>
+            <w:vAlign w:val="center"/>
+          </w:tcPr>
+          <w:p>
+            <w:pPr>
+              <w:tabs>
+                <w:tab w:val="left" w:pos="720"/>
+                <w:tab w:val="left" w:pos="2400"/>
+                <w:tab w:val="left" w:pos="6435"/>
+              </w:tabs>
+              <w:rPr>
+                <w:rFonts w:asciiTheme="minorHAnsi" w:eastAsia="UD Digi Kyokasho N" w:hAnsiTheme="minorHAnsi"/>
+                <w:color w:val="auto"/>
+              </w:rPr>
+            </w:pPr>
+            <w:r>
+              <w:rPr>
+                <w:rFonts w:asciiTheme="minorHAnsi" w:eastAsia="UD Digi Kyokasho N" w:hAnsiTheme="minorHAnsi" w:hint="eastAsia"/>
+                <w:color w:val="auto"/>
+              </w:rPr>
+              <w:t>３</w:t>
+            </w:r>
+          </w:p>
+        </w:tc>
+        <w:tc>
+          <w:tcPr>
+            <w:tcW w:w="719" w:type="dxa"/>
+            <w:vAlign w:val="center"/>
+          </w:tcPr>
+          <w:p>
+            <w:pPr>
+              <w:rPr>
+                <w:rFonts w:asciiTheme="minorHAnsi" w:eastAsia="UD Digi Kyokasho N" w:hAnsiTheme="minorHAnsi"/>
+                <w:color w:val="auto"/>
+              </w:rPr>
+            </w:pPr>
+            <w:r>
+              <w:rPr>
+                <w:rFonts w:asciiTheme="minorHAnsi" w:eastAsia="UD Digi Kyokasho N" w:hAnsiTheme="minorHAnsi" w:hint="eastAsia"/>
+                <w:color w:val="auto"/>
+              </w:rPr>
+              <w:t>１</w:t>
+            </w:r>
+          </w:p>
+        </w:tc>
+        <w:tc>
+          <w:tcPr>
+            <w:tcW w:w="719" w:type="dxa"/>
+            <w:vAlign w:val="center"/>
+          </w:tcPr>
+          <w:p>
+            <w:pPr>
+              <w:tabs>
+                <w:tab w:val="left" w:pos="720"/>
+                <w:tab w:val="left" w:pos="2400"/>
+                <w:tab w:val="left" w:pos="6435"/>
+              </w:tabs>
+              <w:rPr>
+                <w:rFonts w:asciiTheme="minorHAnsi" w:eastAsia="UD Digi Kyokasho N" w:hAnsiTheme="minorHAnsi"/>
+                <w:color w:val="auto"/>
+              </w:rPr>
+            </w:pPr>
+            <w:r>
+              <w:rPr>
+                <w:rFonts w:asciiTheme="minorHAnsi" w:eastAsia="UD Digi Kyokasho N" w:hAnsiTheme="minorHAnsi" w:hint="eastAsia"/>
+                <w:color w:val="auto"/>
+              </w:rPr>
+              <w:t>２</w:t>
+            </w:r>
+          </w:p>
+        </w:tc>
+        <w:tc>
+          <w:tcPr>
+            <w:tcW w:w="719" w:type="dxa"/>
+            <w:vAlign w:val="center"/>
+          </w:tcPr>
+          <w:p>
+            <w:pPr>
+              <w:tabs>
+                <w:tab w:val="left" w:pos="720"/>
+                <w:tab w:val="left" w:pos="2400"/>
+                <w:tab w:val="left" w:pos="6435"/>
+              </w:tabs>
+              <w:rPr>
+                <w:rFonts w:asciiTheme="minorHAnsi" w:eastAsia="UD Digi Kyokasho N" w:hAnsiTheme="minorHAnsi"/>
+                <w:color w:val="auto"/>
+              </w:rPr>
+            </w:pPr>
+            <w:r>
+              <w:rPr>
+                <w:rFonts w:asciiTheme="minorHAnsi" w:eastAsia="UD Digi Kyokasho N" w:hAnsiTheme="minorHAnsi" w:hint="eastAsia"/>
+                <w:color w:val="auto"/>
+              </w:rPr>
+              <w:t>４</w:t>
+            </w:r>
+          </w:p>
+        </w:tc>
+        <w:tc>
+          <w:tcPr>
+            <w:tcW w:w="719" w:type="dxa"/>
+            <w:vAlign w:val="center"/>
+          </w:tcPr>
+          <w:p>
+            <w:pPr>
+              <w:tabs>
+                <w:tab w:val="left" w:pos="720"/>
+                <w:tab w:val="left" w:pos="2400"/>
+                <w:tab w:val="left" w:pos="6435"/>
+              </w:tabs>
+              <w:rPr>
+                <w:rFonts w:asciiTheme="minorHAnsi" w:eastAsia="UD Digi Kyokasho N" w:hAnsiTheme="minorHAnsi"/>
+                <w:color w:val="auto"/>
+              </w:rPr>
+            </w:pPr>
+            <w:r>
+              <w:rPr>
+                <w:rFonts w:asciiTheme="minorHAnsi" w:eastAsia="UD Digi Kyokasho N" w:hAnsiTheme="minorHAnsi" w:hint="eastAsia"/>
+                <w:color w:val="auto"/>
+              </w:rPr>
+              <w:t>２</w:t>
+            </w:r>
+          </w:p>
+        </w:tc>
+        <w:tc>
+          <w:tcPr>
+            <w:tcW w:w="719" w:type="dxa"/>
+            <w:tcBorders>
+              <w:bottom w:val="single" w:sz="4" w:space="0" w:color="auto"/>
+            </w:tcBorders>
+            <w:vAlign w:val="center"/>
+          </w:tcPr>
+          <w:p>
+            <w:pPr>
+              <w:tabs>
+                <w:tab w:val="left" w:pos="720"/>
+                <w:tab w:val="left" w:pos="2400"/>
+                <w:tab w:val="left" w:pos="6435"/>
+              </w:tabs>
+              <w:rPr>
+                <w:rFonts w:asciiTheme="minorHAnsi" w:eastAsia="UD Digi Kyokasho N" w:hAnsiTheme="minorHAnsi"/>
+                <w:color w:val="auto"/>
+              </w:rPr>
+            </w:pPr>
+            <w:r>
+              <w:rPr>
+                <w:rFonts w:asciiTheme="minorHAnsi" w:eastAsia="UD Digi Kyokasho N" w:hAnsiTheme="minorHAnsi" w:hint="eastAsia"/>
+                <w:color w:val="auto"/>
+              </w:rPr>
+              <w:t>３</w:t>
+            </w:r>
+          </w:p>
+        </w:tc>
+        <w:tc>
+          <w:tcPr>
+            <w:tcW w:w="719" w:type="dxa"/>
+            <w:tcBorders>
+              <w:bottom w:val="single" w:sz="4" w:space="0" w:color="auto"/>
+            </w:tcBorders>
+            <w:vAlign w:val="center"/>
+          </w:tcPr>
+          <w:p>
+            <w:pPr>
+              <w:tabs>
+                <w:tab w:val="left" w:pos="720"/>
+                <w:tab w:val="left" w:pos="2400"/>
+                <w:tab w:val="left" w:pos="6435"/>
+              </w:tabs>
+              <w:rPr>
+                <w:rFonts w:asciiTheme="minorHAnsi" w:eastAsia="UD Digi Kyokasho N" w:hAnsiTheme="minorHAnsi"/>
+                <w:color w:val="auto"/>
+              </w:rPr>
+            </w:pPr>
+            <w:r>
+              <w:rPr>
+                <w:rFonts w:asciiTheme="minorHAnsi" w:eastAsia="UD Digi Kyokasho N" w:hAnsiTheme="minorHAnsi" w:hint="eastAsia"/>
+                <w:color w:val="auto"/>
+              </w:rPr>
+              <w:t>４</w:t>
+            </w:r>
+          </w:p>
+        </w:tc>
+        <w:tc>
+          <w:tcPr>
+            <w:tcW w:w="719" w:type="dxa"/>
+            <w:tcBorders>
+              <w:bottom w:val="single" w:sz="4" w:space="0" w:color="auto"/>
+            </w:tcBorders>
+            <w:vAlign w:val="center"/>
+          </w:tcPr>
+          <w:p>
+            <w:pPr>
+              <w:tabs>
+                <w:tab w:val="left" w:pos="720"/>
+                <w:tab w:val="left" w:pos="2400"/>
+                <w:tab w:val="left" w:pos="6435"/>
+              </w:tabs>
+              <w:rPr>
+                <w:rFonts w:asciiTheme="minorHAnsi" w:eastAsia="UD Digi Kyokasho N" w:hAnsiTheme="minorHAnsi"/>
+                <w:color w:val="auto"/>
+              </w:rPr>
+            </w:pPr>
+            <w:r>
+              <w:rPr>
+                <w:rFonts w:asciiTheme="minorHAnsi" w:eastAsia="UD Digi Kyokasho N" w:hAnsiTheme="minorHAnsi" w:hint="eastAsia"/>
+                <w:color w:val="auto"/>
+              </w:rPr>
+              <w:t>３</w:t>
+            </w:r>
+          </w:p>
+        </w:tc>
+        <w:tc>
+          <w:tcPr>
+            <w:tcW w:w="719" w:type="dxa"/>
+            <w:tcBorders>
+              <w:bottom w:val="single" w:sz="4" w:space="0" w:color="auto"/>
+            </w:tcBorders>
+            <w:vAlign w:val="center"/>
+          </w:tcPr>
+          <w:p>
+            <w:pPr>
+              <w:tabs>
+                <w:tab w:val="left" w:pos="720"/>
+                <w:tab w:val="left" w:pos="2400"/>
+                <w:tab w:val="left" w:pos="6435"/>
+              </w:tabs>
+              <w:rPr>
+                <w:rFonts w:asciiTheme="minorHAnsi" w:eastAsia="UD Digi Kyokasho N" w:hAnsiTheme="minorHAnsi"/>
+                <w:color w:val="auto"/>
+              </w:rPr>
+            </w:pPr>
+            <w:r>
+              <w:rPr>
+                <w:rFonts w:asciiTheme="minorHAnsi" w:eastAsia="UD Digi Kyokasho N" w:hAnsiTheme="minorHAnsi" w:hint="eastAsia"/>
+                <w:color w:val="auto"/>
+              </w:rPr>
+              <w:t>４</w:t>
+            </w:r>
+          </w:p>
+        </w:tc>
+        <w:tc>
+          <w:tcPr>
+            <w:tcW w:w="719" w:type="dxa"/>
+            <w:tcBorders>
+              <w:bottom w:val="single" w:sz="4" w:space="0" w:color="auto"/>
+            </w:tcBorders>
+            <w:vAlign w:val="center"/>
+          </w:tcPr>
+          <w:p>
+            <w:pPr>
+              <w:tabs>
+                <w:tab w:val="left" w:pos="720"/>
+                <w:tab w:val="left" w:pos="2400"/>
+                <w:tab w:val="left" w:pos="6435"/>
+              </w:tabs>
+              <w:rPr>
+                <w:rFonts w:asciiTheme="minorHAnsi" w:eastAsia="UD Digi Kyokasho N" w:hAnsiTheme="minorHAnsi"/>
+                <w:color w:val="auto"/>
+              </w:rPr>
+            </w:pPr>
+            <w:r>
+              <w:rPr>
+                <w:rFonts w:asciiTheme="minorHAnsi" w:eastAsia="UD Digi Kyokasho N" w:hAnsiTheme="minorHAnsi" w:hint="eastAsia"/>
+                <w:color w:val="auto"/>
+              </w:rPr>
+              <w:t>３</w:t>
+            </w:r>
+          </w:p>
+        </w:tc>
+        <w:tc>
+          <w:tcPr>
+            <w:tcW w:w="720" w:type="dxa"/>
+            <w:tcBorders>
+              <w:bottom w:val="single" w:sz="4" w:space="0" w:color="auto"/>
+            </w:tcBorders>
+            <w:vAlign w:val="center"/>
+          </w:tcPr>
+          <w:p>
+            <w:pPr>
+              <w:tabs>
+                <w:tab w:val="left" w:pos="720"/>
+                <w:tab w:val="left" w:pos="2400"/>
+                <w:tab w:val="left" w:pos="6435"/>
+              </w:tabs>
+              <w:rPr>
+                <w:rFonts w:asciiTheme="minorHAnsi" w:eastAsia="UD Digi Kyokasho N" w:hAnsiTheme="minorHAnsi"/>
+                <w:color w:val="auto"/>
+              </w:rPr>
+            </w:pPr>
+            <w:r>
+              <w:rPr>
+                <w:rFonts w:asciiTheme="minorHAnsi" w:eastAsia="UD Digi Kyokasho N" w:hAnsiTheme="minorHAnsi" w:hint="eastAsia"/>
+                <w:color w:val="auto"/>
+              </w:rPr>
+              <w:t>４</w:t>
+            </w:r>
+          </w:p>
+        </w:tc>
+        <w:tc>
+          <w:tcPr>
+            <w:tcW w:w="720" w:type="dxa"/>
+            <w:tcBorders>
+              <w:bottom w:val="single" w:sz="4" w:space="0" w:color="auto"/>
+            </w:tcBorders>
+            <w:vAlign w:val="center"/>
+          </w:tcPr>
+          <w:p>
+            <w:pPr>
+              <w:tabs>
+                <w:tab w:val="left" w:pos="720"/>
+                <w:tab w:val="left" w:pos="2400"/>
+                <w:tab w:val="left" w:pos="6435"/>
+              </w:tabs>
+              <w:rPr>
+                <w:rFonts w:asciiTheme="minorHAnsi" w:eastAsia="UD Digi Kyokasho N" w:hAnsiTheme="minorHAnsi"/>
+                <w:color w:val="auto"/>
+              </w:rPr>
+            </w:pPr>
+            <w:r>
+              <w:rPr>
+                <w:rFonts w:asciiTheme="minorHAnsi" w:eastAsia="UD Digi Kyokasho N" w:hAnsiTheme="minorHAnsi" w:hint="eastAsia"/>
+                <w:color w:val="auto"/>
+              </w:rPr>
+              <w:t>１</w:t>
+            </w:r>
+          </w:p>
+        </w:tc>
+      </w:tr>
+      <w:tr>
+        <w:trPr>
+          <w:jc w:val="center"/>
+        </w:trPr>
+        <w:tc>
+          <w:tcPr>
+            <w:tcW w:w="720" w:type="dxa"/>
+            <w:vAlign w:val="center"/>
+          </w:tcPr>
+          <w:p>
+            <w:pPr>
+              <w:tabs>
+                <w:tab w:val="left" w:pos="720"/>
+                <w:tab w:val="left" w:pos="2400"/>
+                <w:tab w:val="left" w:pos="6435"/>
+              </w:tabs>
+              <w:rPr>
+                <w:rFonts w:asciiTheme="minorHAnsi" w:eastAsia="UD Digi Kyokasho N" w:hAnsiTheme="minorHAnsi"/>
+                <w:b/>
+                <w:bCs w:val="0"/>
+                <w:color w:val="auto"/>
+              </w:rPr>
+            </w:pPr>
+            <w:r>
+              <w:rPr>
+                <w:rFonts w:asciiTheme="minorHAnsi" w:eastAsia="UD Digi Kyokasho N" w:hAnsiTheme="minorHAnsi" w:hint="eastAsia"/>
+                <w:b/>
+                <w:bCs w:val="0"/>
+                <w:color w:val="auto"/>
+              </w:rPr>
+              <w:t>もんだい２</w:t>
+            </w:r>
+          </w:p>
+        </w:tc>
+        <w:tc>
+          <w:tcPr>
+            <w:tcW w:w="719" w:type="dxa"/>
+            <w:vAlign w:val="center"/>
+          </w:tcPr>
+          <w:p>
+            <w:pPr>
+              <w:tabs>
+                <w:tab w:val="left" w:pos="720"/>
+                <w:tab w:val="left" w:pos="2400"/>
+                <w:tab w:val="left" w:pos="6435"/>
+              </w:tabs>
+              <w:rPr>
+                <w:rFonts w:asciiTheme="minorHAnsi" w:eastAsia="UD Digi Kyokasho N" w:hAnsiTheme="minorHAnsi"/>
+                <w:color w:val="auto"/>
+              </w:rPr>
+            </w:pPr>
+            <w:r>
+              <w:rPr>
+                <w:rFonts w:asciiTheme="minorHAnsi" w:eastAsia="UD Digi Kyokasho N" w:hAnsiTheme="minorHAnsi" w:hint="eastAsia"/>
+                <w:color w:val="auto"/>
+              </w:rPr>
+              <w:t>１</w:t>
+            </w:r>
+          </w:p>
+        </w:tc>
+        <w:tc>
+          <w:tcPr>
+            <w:tcW w:w="719" w:type="dxa"/>
+            <w:vAlign w:val="center"/>
+          </w:tcPr>
+          <w:p>
+            <w:pPr>
+              <w:tabs>
+                <w:tab w:val="left" w:pos="720"/>
+                <w:tab w:val="left" w:pos="2400"/>
+                <w:tab w:val="left" w:pos="6435"/>
+              </w:tabs>
+              <w:rPr>
+                <w:rFonts w:asciiTheme="minorHAnsi" w:eastAsia="UD Digi Kyokasho N" w:hAnsiTheme="minorHAnsi"/>
+                <w:color w:val="auto"/>
+              </w:rPr>
+            </w:pPr>
+            <w:r>
+              <w:rPr>
+                <w:rFonts w:asciiTheme="minorHAnsi" w:eastAsia="UD Digi Kyokasho N" w:hAnsiTheme="minorHAnsi" w:hint="eastAsia"/>
+                <w:color w:val="auto"/>
+              </w:rPr>
+              <w:t>４</w:t>
+            </w:r>
+          </w:p>
+        </w:tc>
+        <w:tc>
+          <w:tcPr>
+            <w:tcW w:w="719" w:type="dxa"/>
+            <w:vAlign w:val="center"/>
+          </w:tcPr>
+          <w:p>
+            <w:pPr>
+              <w:tabs>
+                <w:tab w:val="left" w:pos="720"/>
+                <w:tab w:val="left" w:pos="2400"/>
+                <w:tab w:val="left" w:pos="6435"/>
+              </w:tabs>
+              <w:rPr>
+                <w:rFonts w:asciiTheme="minorHAnsi" w:eastAsia="UD Digi Kyokasho N" w:hAnsiTheme="minorHAnsi"/>
+                <w:color w:val="auto"/>
+              </w:rPr>
+            </w:pPr>
+            <w:r>
+              <w:rPr>
+                <w:rFonts w:asciiTheme="minorHAnsi" w:eastAsia="UD Digi Kyokasho N" w:hAnsiTheme="minorHAnsi" w:hint="eastAsia"/>
+                <w:color w:val="auto"/>
+              </w:rPr>
+              <w:t>２</w:t>
+            </w:r>
+          </w:p>
+        </w:tc>
+        <w:tc>
+          <w:tcPr>
+            <w:tcW w:w="719" w:type="dxa"/>
+            <w:vAlign w:val="center"/>
+          </w:tcPr>
+          <w:p>
+            <w:pPr>
+              <w:tabs>
+                <w:tab w:val="left" w:pos="720"/>
+                <w:tab w:val="left" w:pos="2400"/>
+                <w:tab w:val="left" w:pos="6435"/>
+              </w:tabs>
+              <w:rPr>
+                <w:rFonts w:asciiTheme="minorHAnsi" w:eastAsia="UD Digi Kyokasho N" w:hAnsiTheme="minorHAnsi"/>
+                <w:color w:val="auto"/>
+              </w:rPr>
+            </w:pPr>
+            <w:r>
+              <w:rPr>
+                <w:rFonts w:asciiTheme="minorHAnsi" w:eastAsia="UD Digi Kyokasho N" w:hAnsiTheme="minorHAnsi" w:hint="eastAsia"/>
+                <w:color w:val="auto"/>
+              </w:rPr>
+              <w:t>３</w:t>
+            </w:r>
+          </w:p>
+        </w:tc>
+        <w:tc>
+          <w:tcPr>
+            <w:tcW w:w="719" w:type="dxa"/>
+            <w:tcBorders>
+              <w:bottom w:val="single" w:sz="4" w:space="0" w:color="auto"/>
+            </w:tcBorders>
+            <w:vAlign w:val="center"/>
+          </w:tcPr>
+          <w:p>
+            <w:pPr>
+              <w:tabs>
+                <w:tab w:val="left" w:pos="720"/>
+                <w:tab w:val="left" w:pos="2400"/>
+                <w:tab w:val="left" w:pos="6435"/>
+              </w:tabs>
+              <w:rPr>
+                <w:rFonts w:asciiTheme="minorHAnsi" w:eastAsia="UD Digi Kyokasho N" w:hAnsiTheme="minorHAnsi"/>
+                <w:color w:val="auto"/>
+              </w:rPr>
+            </w:pPr>
+            <w:r>
+              <w:rPr>
+                <w:rFonts w:asciiTheme="minorHAnsi" w:eastAsia="UD Digi Kyokasho N" w:hAnsiTheme="minorHAnsi" w:hint="eastAsia"/>
+                <w:color w:val="auto"/>
+              </w:rPr>
+              <w:t>３</w:t>
+            </w:r>
+          </w:p>
+        </w:tc>
+        <w:tc>
+          <w:tcPr>
+            <w:tcW w:w="5035" w:type="dxa"/>
+            <w:gridSpan w:val="7"/>
+            <w:tcBorders>
+              <w:bottom w:val="single" w:sz="4" w:space="0" w:color="auto"/>
+              <w:tl2br w:val="single" w:sz="4" w:space="0" w:color="auto"/>
+            </w:tcBorders>
+            <w:vAlign w:val="center"/>
+          </w:tcPr>
+          <w:p>
+            <w:pPr>
+              <w:tabs>
+                <w:tab w:val="left" w:pos="720"/>
+                <w:tab w:val="left" w:pos="2400"/>
+                <w:tab w:val="left" w:pos="6435"/>
+              </w:tabs>
+              <w:rPr>
+                <w:rFonts w:asciiTheme="minorHAnsi" w:eastAsia="UD Digi Kyokasho N" w:hAnsiTheme="minorHAnsi"/>
+                <w:color w:val="auto"/>
+              </w:rPr>
+            </w:pPr>
+          </w:p>
+        </w:tc>
+      </w:tr>
+      <w:tr>
+        <w:trPr>
+          <w:jc w:val="center"/>
+        </w:trPr>
+        <w:tc>
+          <w:tcPr>
+            <w:tcW w:w="720" w:type="dxa"/>
+            <w:vAlign w:val="center"/>
+          </w:tcPr>
+          <w:p>
+            <w:pPr>
+              <w:tabs>
+                <w:tab w:val="left" w:pos="720"/>
+                <w:tab w:val="left" w:pos="2400"/>
+                <w:tab w:val="left" w:pos="6435"/>
+              </w:tabs>
+              <w:rPr>
+                <w:rFonts w:asciiTheme="minorHAnsi" w:eastAsia="UD Digi Kyokasho N" w:hAnsiTheme="minorHAnsi"/>
+                <w:b/>
+                <w:bCs w:val="0"/>
+                <w:color w:val="auto"/>
+              </w:rPr>
+            </w:pPr>
+            <w:r>
+              <w:rPr>
+                <w:rFonts w:asciiTheme="minorHAnsi" w:eastAsia="UD Digi Kyokasho N" w:hAnsiTheme="minorHAnsi" w:hint="eastAsia"/>
+                <w:b/>
+                <w:bCs w:val="0"/>
+                <w:color w:val="auto"/>
+              </w:rPr>
+              <w:t>もんだい３</w:t>
+            </w:r>
+          </w:p>
+        </w:tc>
+        <w:tc>
+          <w:tcPr>
+            <w:tcW w:w="719" w:type="dxa"/>
+            <w:vAlign w:val="center"/>
+          </w:tcPr>
+          <w:p>
+            <w:pPr>
+              <w:tabs>
+                <w:tab w:val="left" w:pos="720"/>
+                <w:tab w:val="left" w:pos="2400"/>
+                <w:tab w:val="left" w:pos="6435"/>
+              </w:tabs>
+              <w:rPr>
+                <w:rFonts w:asciiTheme="minorHAnsi" w:eastAsia="UD Digi Kyokasho N" w:hAnsiTheme="minorHAnsi"/>
+                <w:color w:val="auto"/>
+              </w:rPr>
+            </w:pPr>
+            <w:r>
+              <w:rPr>
+                <w:rFonts w:asciiTheme="minorHAnsi" w:eastAsia="UD Digi Kyokasho N" w:hAnsiTheme="minorHAnsi" w:hint="eastAsia"/>
+                <w:color w:val="auto"/>
+              </w:rPr>
+              <w:t>２</w:t>
+            </w:r>
+          </w:p>
+        </w:tc>
+        <w:tc>
+          <w:tcPr>
+            <w:tcW w:w="719" w:type="dxa"/>
+            <w:vAlign w:val="center"/>
+          </w:tcPr>
+          <w:p>
+            <w:pPr>
+              <w:tabs>
+                <w:tab w:val="left" w:pos="720"/>
+                <w:tab w:val="left" w:pos="2400"/>
+                <w:tab w:val="left" w:pos="6435"/>
+              </w:tabs>
+              <w:rPr>
+                <w:rFonts w:asciiTheme="minorHAnsi" w:eastAsia="UD Digi Kyokasho N" w:hAnsiTheme="minorHAnsi"/>
+                <w:color w:val="auto"/>
+              </w:rPr>
+            </w:pPr>
+            <w:r>
+              <w:rPr>
+                <w:rFonts w:asciiTheme="minorHAnsi" w:eastAsia="UD Digi Kyokasho N" w:hAnsiTheme="minorHAnsi" w:hint="eastAsia"/>
+                <w:color w:val="auto"/>
+              </w:rPr>
+              <w:t>３</w:t>
+            </w:r>
+          </w:p>
+        </w:tc>
+        <w:tc>
+          <w:tcPr>
+            <w:tcW w:w="719" w:type="dxa"/>
+            <w:vAlign w:val="center"/>
+          </w:tcPr>
+          <w:p>
+            <w:pPr>
+              <w:tabs>
+                <w:tab w:val="left" w:pos="720"/>
+                <w:tab w:val="left" w:pos="2400"/>
+                <w:tab w:val="left" w:pos="6435"/>
+              </w:tabs>
+              <w:rPr>
+                <w:rFonts w:asciiTheme="minorHAnsi" w:eastAsia="UD Digi Kyokasho N" w:hAnsiTheme="minorHAnsi"/>
+                <w:color w:val="auto"/>
+              </w:rPr>
+            </w:pPr>
+            <w:r>
+              <w:rPr>
+                <w:rFonts w:asciiTheme="minorHAnsi" w:eastAsia="UD Digi Kyokasho N" w:hAnsiTheme="minorHAnsi" w:hint="eastAsia"/>
+                <w:color w:val="auto"/>
+              </w:rPr>
+              <w:t>１</w:t>
+            </w:r>
+          </w:p>
+        </w:tc>
+        <w:tc>
+          <w:tcPr>
+            <w:tcW w:w="719" w:type="dxa"/>
+            <w:vAlign w:val="center"/>
+          </w:tcPr>
+          <w:p>
+            <w:pPr>
+              <w:tabs>
+                <w:tab w:val="left" w:pos="720"/>
+                <w:tab w:val="left" w:pos="2400"/>
+                <w:tab w:val="left" w:pos="6435"/>
+              </w:tabs>
+              <w:rPr>
+                <w:rFonts w:asciiTheme="minorHAnsi" w:eastAsia="UD Digi Kyokasho N" w:hAnsiTheme="minorHAnsi"/>
+                <w:color w:val="auto"/>
+              </w:rPr>
+            </w:pPr>
+            <w:r>
+              <w:rPr>
+                <w:rFonts w:asciiTheme="minorHAnsi" w:eastAsia="UD Digi Kyokasho N" w:hAnsiTheme="minorHAnsi" w:hint="eastAsia"/>
+                <w:color w:val="auto"/>
+              </w:rPr>
+              <w:t>４</w:t>
+            </w:r>
+          </w:p>
+        </w:tc>
+        <w:tc>
+          <w:tcPr>
+            <w:tcW w:w="5754" w:type="dxa"/>
+            <w:gridSpan w:val="8"/>
+            <w:tcBorders>
+              <w:bottom w:val="single" w:sz="4" w:space="0" w:color="auto"/>
+              <w:tl2br w:val="single" w:sz="4" w:space="0" w:color="auto"/>
+            </w:tcBorders>
+            <w:vAlign w:val="center"/>
+          </w:tcPr>
+          <w:p>
+            <w:pPr>
+              <w:tabs>
+                <w:tab w:val="left" w:pos="720"/>
+                <w:tab w:val="left" w:pos="2400"/>
+                <w:tab w:val="left" w:pos="6435"/>
+              </w:tabs>
+              <w:rPr>
+                <w:rFonts w:asciiTheme="minorHAnsi" w:eastAsia="UD Digi Kyokasho N" w:hAnsiTheme="minorHAnsi"/>
+                <w:color w:val="auto"/>
+              </w:rPr>
+            </w:pPr>
+          </w:p>
+        </w:tc>
+      </w:tr>
+      <w:tr>
+        <w:trPr>
+          <w:jc w:val="center"/>
+        </w:trPr>
+        <w:tc>
+          <w:tcPr>
+            <w:tcW w:w="720" w:type="dxa"/>
+            <w:vAlign w:val="center"/>
+          </w:tcPr>
+          <w:p>
+            <w:pPr>
+              <w:tabs>
+                <w:tab w:val="left" w:pos="720"/>
+                <w:tab w:val="left" w:pos="2400"/>
+                <w:tab w:val="left" w:pos="6435"/>
+              </w:tabs>
+              <w:rPr>
+                <w:rFonts w:asciiTheme="minorHAnsi" w:eastAsia="UD Digi Kyokasho N" w:hAnsiTheme="minorHAnsi"/>
+                <w:b/>
+                <w:bCs w:val="0"/>
+                <w:color w:val="auto"/>
+              </w:rPr>
+            </w:pPr>
+            <w:r>
+              <w:rPr>
+                <w:rFonts w:asciiTheme="minorHAnsi" w:eastAsia="UD Digi Kyokasho N" w:hAnsiTheme="minorHAnsi" w:hint="eastAsia"/>
+                <w:b/>
+                <w:bCs w:val="0"/>
+                <w:color w:val="auto"/>
+              </w:rPr>
+              <w:t>もんだい４</w:t>
+            </w:r>
+          </w:p>
+        </w:tc>
+        <w:tc>
+          <w:tcPr>
+            <w:tcW w:w="719" w:type="dxa"/>
+            <w:vAlign w:val="center"/>
+          </w:tcPr>
+          <w:p>
+            <w:pPr>
+              <w:tabs>
+                <w:tab w:val="left" w:pos="720"/>
+                <w:tab w:val="left" w:pos="2400"/>
+                <w:tab w:val="left" w:pos="6435"/>
+              </w:tabs>
+              <w:rPr>
+                <w:rFonts w:asciiTheme="minorHAnsi" w:eastAsia="UD Digi Kyokasho N" w:hAnsiTheme="minorHAnsi"/>
+                <w:color w:val="auto"/>
+              </w:rPr>
+            </w:pPr>
+            <w:r>
+              <w:rPr>
+                <w:rFonts w:asciiTheme="minorHAnsi" w:eastAsia="UD Digi Kyokasho N" w:hAnsiTheme="minorHAnsi" w:hint="eastAsia"/>
+                <w:color w:val="auto"/>
+              </w:rPr>
+              <w:t>２</w:t>
+            </w:r>
+          </w:p>
+        </w:tc>
+        <w:tc>
+          <w:tcPr>
+            <w:tcW w:w="719" w:type="dxa"/>
+            <w:vAlign w:val="center"/>
+          </w:tcPr>
+          <w:p>
+            <w:pPr>
+              <w:tabs>
+                <w:tab w:val="left" w:pos="720"/>
+                <w:tab w:val="left" w:pos="2400"/>
+                <w:tab w:val="left" w:pos="6435"/>
+              </w:tabs>
+              <w:rPr>
+                <w:rFonts w:asciiTheme="minorHAnsi" w:eastAsia="UD Digi Kyokasho N" w:hAnsiTheme="minorHAnsi"/>
+                <w:color w:val="auto"/>
+              </w:rPr>
+            </w:pPr>
+            <w:r>
+              <w:rPr>
+                <w:rFonts w:asciiTheme="minorHAnsi" w:eastAsia="UD Digi Kyokasho N" w:hAnsiTheme="minorHAnsi" w:hint="eastAsia"/>
+                <w:color w:val="auto"/>
+              </w:rPr>
+              <w:t>４</w:t>
+            </w:r>
+          </w:p>
+        </w:tc>
+        <w:tc>
+          <w:tcPr>
+            <w:tcW w:w="719" w:type="dxa"/>
+            <w:vAlign w:val="center"/>
+          </w:tcPr>
+          <w:p>
+            <w:pPr>
+              <w:tabs>
+                <w:tab w:val="left" w:pos="720"/>
+                <w:tab w:val="left" w:pos="2400"/>
+                <w:tab w:val="left" w:pos="6435"/>
+              </w:tabs>
+              <w:rPr>
+                <w:rFonts w:asciiTheme="minorHAnsi" w:eastAsia="UD Digi Kyokasho N" w:hAnsiTheme="minorHAnsi"/>
+                <w:color w:val="auto"/>
+              </w:rPr>
+            </w:pPr>
+            <w:r>
+              <w:rPr>
+                <w:rFonts w:asciiTheme="minorHAnsi" w:eastAsia="UD Digi Kyokasho N" w:hAnsiTheme="minorHAnsi" w:hint="eastAsia"/>
+                <w:color w:val="auto"/>
+              </w:rPr>
+              <w:t>３</w:t>
+            </w:r>
+          </w:p>
+        </w:tc>
+        <w:tc>
+          <w:tcPr>
+            <w:tcW w:w="719" w:type="dxa"/>
+            <w:vAlign w:val="center"/>
+          </w:tcPr>
+          <w:p>
+            <w:pPr>
+              <w:tabs>
+                <w:tab w:val="left" w:pos="720"/>
+                <w:tab w:val="left" w:pos="2400"/>
+                <w:tab w:val="left" w:pos="6435"/>
+              </w:tabs>
+              <w:rPr>
+                <w:rFonts w:asciiTheme="minorHAnsi" w:eastAsia="UD Digi Kyokasho N" w:hAnsiTheme="minorHAnsi"/>
+                <w:color w:val="auto"/>
+              </w:rPr>
+            </w:pPr>
+            <w:r>
+              <w:rPr>
+                <w:rFonts w:asciiTheme="minorHAnsi" w:eastAsia="UD Digi Kyokasho N" w:hAnsiTheme="minorHAnsi" w:hint="eastAsia"/>
+                <w:color w:val="auto"/>
+              </w:rPr>
+              <w:t>１</w:t>
+            </w:r>
+          </w:p>
+        </w:tc>
+        <w:tc>
+          <w:tcPr>
+            <w:tcW w:w="5754" w:type="dxa"/>
+            <w:gridSpan w:val="8"/>
+            <w:tcBorders>
+              <w:bottom w:val="single" w:sz="4" w:space="0" w:color="auto"/>
+              <w:tl2br w:val="single" w:sz="4" w:space="0" w:color="auto"/>
+            </w:tcBorders>
+            <w:vAlign w:val="center"/>
+          </w:tcPr>
+          <w:p>
+            <w:pPr>
+              <w:tabs>
+                <w:tab w:val="left" w:pos="720"/>
+                <w:tab w:val="left" w:pos="2400"/>
+                <w:tab w:val="left" w:pos="6435"/>
+              </w:tabs>
+              <w:rPr>
+                <w:rFonts w:asciiTheme="minorHAnsi" w:eastAsia="UD Digi Kyokasho N" w:hAnsiTheme="minorHAnsi"/>
+                <w:color w:val="auto"/>
+              </w:rPr>
+            </w:pPr>
+          </w:p>
+          <w:p>
+            <w:pPr>
+              <w:tabs>
+                <w:tab w:val="left" w:pos="720"/>
+                <w:tab w:val="left" w:pos="2400"/>
+                <w:tab w:val="left" w:pos="6435"/>
+              </w:tabs>
+              <w:rPr>
+                <w:rFonts w:asciiTheme="minorHAnsi" w:eastAsia="UD Digi Kyokasho N" w:hAnsiTheme="minorHAnsi"/>
+                <w:color w:val="auto"/>
+              </w:rPr>
+            </w:pPr>
+          </w:p>
+        </w:tc>
+      </w:tr>
+      <w:tr>
+        <w:trPr>
+          <w:jc w:val="center"/>
+        </w:trPr>
+        <w:tc>
+          <w:tcPr>
+            <w:tcW w:w="720" w:type="dxa"/>
+            <w:vAlign w:val="center"/>
+          </w:tcPr>
+          <w:p>
+            <w:pPr>
+              <w:tabs>
+                <w:tab w:val="left" w:pos="720"/>
+                <w:tab w:val="left" w:pos="2400"/>
+                <w:tab w:val="left" w:pos="6435"/>
+              </w:tabs>
+              <w:rPr>
+                <w:rFonts w:asciiTheme="minorHAnsi" w:eastAsia="UD Digi Kyokasho N" w:hAnsiTheme="minorHAnsi"/>
+                <w:b/>
+                <w:bCs w:val="0"/>
+                <w:color w:val="auto"/>
+              </w:rPr>
+            </w:pPr>
+            <w:r>
+              <w:rPr>
+                <w:rFonts w:asciiTheme="minorHAnsi" w:eastAsia="UD Digi Kyokasho N" w:hAnsiTheme="minorHAnsi" w:hint="eastAsia"/>
+                <w:b/>
+                <w:bCs w:val="0"/>
+                <w:color w:val="auto"/>
+              </w:rPr>
+              <w:t>もんだい</w:t>
+            </w:r>
+            <w:r>
+              <w:rPr>
+                <w:rFonts w:asciiTheme="minorHAnsi" w:eastAsia="UD Digi Kyokasho N" w:hAnsiTheme="minorHAnsi" w:hint="eastAsia"/>
+                <w:b/>
+                <w:bCs w:val="0"/>
+                <w:color w:val="auto"/>
+              </w:rPr>
+              <w:t>５</w:t>
+            </w:r>
+          </w:p>
+        </w:tc>
+        <w:tc>
+          <w:tcPr>
+            <w:tcW w:w="719" w:type="dxa"/>
+            <w:vAlign w:val="center"/>
+          </w:tcPr>
+          <w:p>
+            <w:pPr>
+              <w:tabs>
+                <w:tab w:val="left" w:pos="720"/>
+                <w:tab w:val="left" w:pos="2400"/>
+                <w:tab w:val="left" w:pos="6435"/>
+              </w:tabs>
+              <w:rPr>
+                <w:rFonts w:asciiTheme="minorHAnsi" w:eastAsia="UD Digi Kyokasho N" w:hAnsiTheme="minorHAnsi"/>
+                <w:color w:val="auto"/>
+              </w:rPr>
+            </w:pPr>
+            <w:r>
+              <w:rPr>
+                <w:rFonts w:asciiTheme="minorHAnsi" w:eastAsia="UD Digi Kyokasho N" w:hAnsiTheme="minorHAnsi" w:hint="eastAsia"/>
+                <w:color w:val="auto"/>
+              </w:rPr>
+              <w:t>２</w:t>
+            </w:r>
+          </w:p>
+        </w:tc>
+        <w:tc>
+          <w:tcPr>
+            <w:tcW w:w="719" w:type="dxa"/>
+            <w:vAlign w:val="center"/>
+          </w:tcPr>
+          <w:p>
+            <w:pPr>
+              <w:tabs>
+                <w:tab w:val="left" w:pos="720"/>
+                <w:tab w:val="left" w:pos="2400"/>
+                <w:tab w:val="left" w:pos="6435"/>
+              </w:tabs>
+              <w:rPr>
+                <w:rFonts w:asciiTheme="minorHAnsi" w:eastAsia="UD Digi Kyokasho N" w:hAnsiTheme="minorHAnsi"/>
+                <w:color w:val="auto"/>
+              </w:rPr>
+            </w:pPr>
+            <w:r>
+              <w:rPr>
+                <w:rFonts w:asciiTheme="minorHAnsi" w:eastAsia="UD Digi Kyokasho N" w:hAnsiTheme="minorHAnsi" w:hint="eastAsia"/>
+                <w:color w:val="auto"/>
+              </w:rPr>
+              <w:t>３</w:t>
+            </w:r>
+          </w:p>
+        </w:tc>
+        <w:tc>
+          <w:tcPr>
+            <w:tcW w:w="719" w:type="dxa"/>
+            <w:tcBorders>
+              <w:bottom w:val="single" w:sz="4" w:space="0" w:color="auto"/>
+            </w:tcBorders>
+            <w:vAlign w:val="center"/>
+          </w:tcPr>
+          <w:p>
+            <w:pPr>
+              <w:tabs>
+                <w:tab w:val="left" w:pos="720"/>
+                <w:tab w:val="left" w:pos="2400"/>
+                <w:tab w:val="left" w:pos="6435"/>
+              </w:tabs>
+              <w:rPr>
+                <w:rFonts w:asciiTheme="minorHAnsi" w:eastAsia="UD Digi Kyokasho N" w:hAnsiTheme="minorHAnsi"/>
+                <w:color w:val="auto"/>
+              </w:rPr>
+            </w:pPr>
+            <w:r>
+              <w:rPr>
+                <w:rFonts w:asciiTheme="minorHAnsi" w:eastAsia="UD Digi Kyokasho N" w:hAnsiTheme="minorHAnsi" w:hint="eastAsia"/>
+                <w:color w:val="auto"/>
+              </w:rPr>
+              <w:t>２</w:t>
+            </w:r>
+          </w:p>
+        </w:tc>
+        <w:tc>
+          <w:tcPr>
+            <w:tcW w:w="719" w:type="dxa"/>
+            <w:tcBorders>
+              <w:bottom w:val="single" w:sz="4" w:space="0" w:color="auto"/>
+            </w:tcBorders>
+            <w:vAlign w:val="center"/>
+          </w:tcPr>
+          <w:p>
+            <w:pPr>
+              <w:tabs>
+                <w:tab w:val="left" w:pos="720"/>
+                <w:tab w:val="left" w:pos="2400"/>
+                <w:tab w:val="left" w:pos="6435"/>
+              </w:tabs>
+              <w:rPr>
+                <w:rFonts w:asciiTheme="minorHAnsi" w:eastAsia="UD Digi Kyokasho N" w:hAnsiTheme="minorHAnsi"/>
+                <w:color w:val="auto"/>
+              </w:rPr>
+            </w:pPr>
+            <w:r>
+              <w:rPr>
+                <w:rFonts w:asciiTheme="minorHAnsi" w:eastAsia="UD Digi Kyokasho N" w:hAnsiTheme="minorHAnsi" w:hint="eastAsia"/>
+                <w:color w:val="auto"/>
+              </w:rPr>
+              <w:t>３</w:t>
+            </w:r>
+          </w:p>
+        </w:tc>
+        <w:tc>
+          <w:tcPr>
+            <w:tcW w:w="5754" w:type="dxa"/>
+            <w:gridSpan w:val="8"/>
+            <w:tcBorders>
+              <w:bottom w:val="single" w:sz="4" w:space="0" w:color="auto"/>
+              <w:tl2br w:val="single" w:sz="4" w:space="0" w:color="auto"/>
+            </w:tcBorders>
+            <w:vAlign w:val="center"/>
+          </w:tcPr>
+          <w:p>
+            <w:pPr>
+              <w:tabs>
+                <w:tab w:val="left" w:pos="720"/>
+                <w:tab w:val="left" w:pos="2400"/>
+                <w:tab w:val="left" w:pos="6435"/>
+              </w:tabs>
+              <w:rPr>
+                <w:rFonts w:asciiTheme="minorHAnsi" w:eastAsia="UD Digi Kyokasho N" w:hAnsiTheme="minorHAnsi"/>
+                <w:color w:val="auto"/>
+              </w:rPr>
+            </w:pPr>
+          </w:p>
+        </w:tc>
+      </w:tr>
+      <w:tr>
+        <w:trPr>
+          <w:jc w:val="center"/>
+        </w:trPr>
+        <w:tc>
+          <w:tcPr>
+            <w:tcW w:w="720" w:type="dxa"/>
+            <w:vAlign w:val="center"/>
+          </w:tcPr>
+          <w:p>
+            <w:pPr>
+              <w:tabs>
+                <w:tab w:val="left" w:pos="720"/>
+                <w:tab w:val="left" w:pos="2400"/>
+                <w:tab w:val="left" w:pos="6435"/>
+              </w:tabs>
+              <w:rPr>
+                <w:rFonts w:asciiTheme="minorHAnsi" w:eastAsia="UD Digi Kyokasho N" w:hAnsiTheme="minorHAnsi"/>
+                <w:b/>
+                <w:bCs w:val="0"/>
+                <w:color w:val="auto"/>
+              </w:rPr>
+            </w:pPr>
+            <w:r>
+              <w:rPr>
+                <w:rFonts w:asciiTheme="minorHAnsi" w:eastAsia="UD Digi Kyokasho N" w:hAnsiTheme="minorHAnsi" w:hint="eastAsia"/>
+                <w:b/>
+                <w:bCs w:val="0"/>
+                <w:color w:val="auto"/>
+              </w:rPr>
+              <w:t>もんだい</w:t>
+            </w:r>
+            <w:r>
+              <w:rPr>
+                <w:rFonts w:asciiTheme="minorHAnsi" w:eastAsia="UD Digi Kyokasho N" w:hAnsiTheme="minorHAnsi" w:hint="eastAsia"/>
+                <w:b/>
+                <w:bCs w:val="0"/>
+                <w:color w:val="auto"/>
+              </w:rPr>
+              <w:t>６</w:t>
+            </w:r>
+          </w:p>
+        </w:tc>
+        <w:tc>
+          <w:tcPr>
+            <w:tcW w:w="719" w:type="dxa"/>
+            <w:vAlign w:val="center"/>
+          </w:tcPr>
+          <w:p>
+            <w:pPr>
+              <w:tabs>
+                <w:tab w:val="left" w:pos="720"/>
+                <w:tab w:val="left" w:pos="2400"/>
+                <w:tab w:val="left" w:pos="6435"/>
+              </w:tabs>
+              <w:rPr>
+                <w:rFonts w:asciiTheme="minorHAnsi" w:eastAsia="UD Digi Kyokasho N" w:hAnsiTheme="minorHAnsi"/>
+                <w:color w:val="auto"/>
+              </w:rPr>
+            </w:pPr>
+            <w:r>
+              <w:rPr>
+                <w:rFonts w:asciiTheme="minorHAnsi" w:eastAsia="UD Digi Kyokasho N" w:hAnsiTheme="minorHAnsi" w:hint="eastAsia"/>
+                <w:color w:val="auto"/>
+              </w:rPr>
+              <w:t>２</w:t>
+            </w:r>
+          </w:p>
+        </w:tc>
+        <w:tc>
+          <w:tcPr>
+            <w:tcW w:w="719" w:type="dxa"/>
+            <w:vAlign w:val="center"/>
+          </w:tcPr>
+          <w:p>
+            <w:pPr>
+              <w:tabs>
+                <w:tab w:val="left" w:pos="720"/>
+                <w:tab w:val="left" w:pos="2400"/>
+                <w:tab w:val="left" w:pos="6435"/>
+              </w:tabs>
+              <w:rPr>
+                <w:rFonts w:asciiTheme="minorHAnsi" w:eastAsia="UD Digi Kyokasho N" w:hAnsiTheme="minorHAnsi"/>
+                <w:color w:val="auto"/>
+              </w:rPr>
+            </w:pPr>
+            <w:r>
+              <w:rPr>
+                <w:rFonts w:asciiTheme="minorHAnsi" w:eastAsia="UD Digi Kyokasho N" w:hAnsiTheme="minorHAnsi" w:hint="eastAsia"/>
+                <w:color w:val="auto"/>
+              </w:rPr>
+              <w:t>２</w:t>
+            </w:r>
+          </w:p>
+        </w:tc>
+        <w:tc>
+          <w:tcPr>
+            <w:tcW w:w="7192" w:type="dxa"/>
+            <w:gridSpan w:val="10"/>
+            <w:tcBorders>
+              <w:tl2br w:val="single" w:sz="4" w:space="0" w:color="auto"/>
+            </w:tcBorders>
+            <w:vAlign w:val="center"/>
+          </w:tcPr>
+          <w:p>
+            <w:pPr>
+              <w:tabs>
+                <w:tab w:val="left" w:pos="720"/>
+                <w:tab w:val="left" w:pos="2400"/>
+                <w:tab w:val="left" w:pos="6435"/>
+              </w:tabs>
+              <w:rPr>
+                <w:rFonts w:asciiTheme="minorHAnsi" w:eastAsia="UD Digi Kyokasho N" w:hAnsiTheme="minorHAnsi"/>
+                <w:color w:val="auto"/>
+              </w:rPr>
+            </w:pPr>
+          </w:p>
+        </w:tc>
+      </w:tr>
+    </w:tbl>
+    <w:p>
+      <w:pPr>
+        <w:tabs>
+          <w:tab w:val="left" w:pos="720"/>
+          <w:tab w:val="left" w:pos="2400"/>
+          <w:tab w:val="left" w:pos="6435"/>
+        </w:tabs>
+        <w:rPr>
+          <w:rFonts w:asciiTheme="minorHAnsi" w:eastAsia="UD Digi Kyokasho N" w:hAnsiTheme="minorHAnsi"/>
+          <w:b/>
+          <w:bCs w:val="0"/>
+          <w:color w:val="EE0000"/>
+          <w:sz w:val="28"/>
         </w:rPr>
       </w:pPr>
     </w:p>

</xml_diff>